<commit_message>
Sync schedule files 2026-05-07 11:47
</commit_message>
<xml_diff>
--- a/schedule/11.05.2026 ПОНЕДЕЛЬНИК.docx
+++ b/schedule/11.05.2026 ПОНЕДЕЛЬНИК.docx
@@ -1,6 +1,6 @@
 
 <file path=word/document.xml><?xml version="1.0" encoding="utf-8"?>
-<w:document xmlns:r="http://schemas.openxmlformats.org/officeDocument/2006/relationships" xmlns:mc="http://schemas.openxmlformats.org/markup-compatibility/2006" xmlns:vyd="http://volga.yandex.com/schemas/document/model" xmlns:w="http://schemas.openxmlformats.org/wordprocessingml/2006/main" w:conformance="transitional" mc:Ignorable="vyd">
+<w:document xmlns:mc="http://schemas.openxmlformats.org/markup-compatibility/2006" xmlns:vyd="http://volga.yandex.com/schemas/document/model" xmlns:w="http://schemas.openxmlformats.org/wordprocessingml/2006/main" xmlns:r="http://schemas.openxmlformats.org/officeDocument/2006/relationships" w:conformance="transitional" mc:Ignorable="vyd">
   <w:background w:color="FFFFFF"/>
   <w:body vyd:_id="vyd:00000000000001">
     <w:p vyd:_id="vyd:0000000000024d">
@@ -4740,6 +4740,14 @@
                 <w:rFonts w:ascii="Times New Roman" w:hAnsi="Times New Roman" w:cs="Times New Roman"/>
               </w:rPr>
             </w:pPr>
+            <w:r>
+              <w:rPr>
+                <w:rFonts w:ascii="Times New Roman" w:hAnsi="Times New Roman" w:cs="Times New Roman"/>
+                <w:sz w:val="24"/>
+                <w:color w:val="000000"/>
+              </w:rPr>
+              <w:t vyd:_id="vyd:movb8mkw79unau">Электромагнитные колебания</w:t>
+            </w:r>
           </w:p>
         </w:tc>
         <w:tc vyd:_id="vyd:000000000001r9">
@@ -4952,6 +4960,12 @@
                 <w:rFonts w:ascii="Times New Roman" w:hAnsi="Times New Roman" w:cs="Times New Roman"/>
               </w:rPr>
             </w:pPr>
+            <w:r>
+              <w:rPr>
+                <w:rFonts w:ascii="Times New Roman" w:hAnsi="Times New Roman" w:cs="Times New Roman"/>
+              </w:rPr>
+              <w:t vyd:_id="vyd:movb9lfvphr4om">мах</w:t>
+            </w:r>
           </w:p>
         </w:tc>
         <w:tc vyd:_id="vyd:000000000001qp">
@@ -5164,6 +5178,12 @@
                 <w:rFonts w:ascii="Times New Roman" w:hAnsi="Times New Roman" w:cs="Times New Roman"/>
               </w:rPr>
             </w:pPr>
+            <w:r>
+              <w:rPr>
+                <w:rFonts w:ascii="Times New Roman" w:hAnsi="Times New Roman" w:cs="Times New Roman"/>
+              </w:rPr>
+              <w:t vyd:_id="vyd:movb9ok2cgh610">конспект</w:t>
+            </w:r>
           </w:p>
         </w:tc>
         <w:tc vyd:_id="vyd:000000000001q5">
@@ -5636,6 +5656,12 @@
                 <w:rFonts w:ascii="Times New Roman" w:hAnsi="Times New Roman" w:cs="Times New Roman"/>
               </w:rPr>
             </w:pPr>
+            <w:r>
+              <w:rPr>
+                <w:rFonts w:ascii="Times New Roman" w:hAnsi="Times New Roman" w:cs="Times New Roman"/>
+              </w:rPr>
+              <w:t vyd:_id="vyd:movba6aq3awvwu">Электромагнитные волны</w:t>
+            </w:r>
           </w:p>
         </w:tc>
         <w:tc vyd:_id="vyd:000000000001ot">
@@ -5851,6 +5877,12 @@
                 <w:rFonts w:ascii="Times New Roman" w:hAnsi="Times New Roman" w:cs="Times New Roman"/>
               </w:rPr>
             </w:pPr>
+            <w:r>
+              <w:rPr>
+                <w:rFonts w:ascii="Times New Roman" w:hAnsi="Times New Roman" w:cs="Times New Roman"/>
+              </w:rPr>
+              <w:t vyd:_id="vyd:movbam0pqog6sa">мах</w:t>
+            </w:r>
           </w:p>
         </w:tc>
         <w:tc vyd:_id="vyd:000000000001o9">
@@ -6066,6 +6098,12 @@
                 <w:rFonts w:ascii="Times New Roman" w:hAnsi="Times New Roman" w:cs="Times New Roman"/>
               </w:rPr>
             </w:pPr>
+            <w:r>
+              <w:rPr>
+                <w:rFonts w:ascii="Times New Roman" w:hAnsi="Times New Roman" w:cs="Times New Roman"/>
+              </w:rPr>
+              <w:t vyd:_id="vyd:movbaq27qml1s7">Решение задач</w:t>
+            </w:r>
           </w:p>
         </w:tc>
         <w:tc vyd:_id="vyd:000000000001np">
@@ -6237,83 +6275,6 @@
         </w:rPr>
       </w:pPr>
     </w:p>
-    <w:p vyd:_id="vyd:000000000001n9">
-      <w:pPr>
-        <w:pStyle w:val="Normal"/>
-        <w:spacing w:lineRule="auto" w:line="240" w:before="0" w:after="0"/>
-        <w:jc w:val="end"/>
-        <w:rPr>
-          <w:rFonts w:ascii="Times New Roman" w:hAnsi="Times New Roman" w:cs="Times New Roman"/>
-          <w:sz w:val="20"/>
-        </w:rPr>
-      </w:pPr>
-    </w:p>
-    <w:p vyd:_id="vyd:000000000001n8">
-      <w:pPr>
-        <w:pStyle w:val="Normal"/>
-        <w:spacing w:lineRule="auto" w:line="240" w:before="0" w:after="0"/>
-        <w:jc w:val="end"/>
-        <w:rPr>
-          <w:rFonts w:ascii="Times New Roman" w:hAnsi="Times New Roman" w:cs="Times New Roman"/>
-          <w:sz w:val="20"/>
-        </w:rPr>
-      </w:pPr>
-    </w:p>
-    <w:p vyd:_id="vyd:000000000001n7">
-      <w:pPr>
-        <w:pStyle w:val="Normal"/>
-        <w:spacing w:lineRule="auto" w:line="240" w:before="0" w:after="0"/>
-        <w:jc w:val="end"/>
-        <w:rPr>
-          <w:rFonts w:ascii="Times New Roman" w:hAnsi="Times New Roman" w:cs="Times New Roman"/>
-          <w:sz w:val="20"/>
-        </w:rPr>
-      </w:pPr>
-    </w:p>
-    <w:p vyd:_id="vyd:000000000001n6">
-      <w:pPr>
-        <w:pStyle w:val="Normal"/>
-        <w:spacing w:lineRule="auto" w:line="240" w:before="0" w:after="0"/>
-        <w:jc w:val="end"/>
-        <w:rPr>
-          <w:rFonts w:ascii="Times New Roman" w:hAnsi="Times New Roman" w:cs="Times New Roman"/>
-          <w:sz w:val="20"/>
-        </w:rPr>
-      </w:pPr>
-    </w:p>
-    <w:p vyd:_id="vyd:000000000001n5">
-      <w:pPr>
-        <w:pStyle w:val="Normal"/>
-        <w:spacing w:lineRule="auto" w:line="240" w:before="0" w:after="0"/>
-        <w:jc w:val="end"/>
-        <w:rPr>
-          <w:rFonts w:ascii="Times New Roman" w:hAnsi="Times New Roman" w:cs="Times New Roman"/>
-          <w:sz w:val="20"/>
-        </w:rPr>
-      </w:pPr>
-    </w:p>
-    <w:p vyd:_id="vyd:000000000001n4">
-      <w:pPr>
-        <w:pStyle w:val="Normal"/>
-        <w:spacing w:lineRule="auto" w:line="240" w:before="0" w:after="0"/>
-        <w:jc w:val="end"/>
-        <w:rPr>
-          <w:rFonts w:ascii="Times New Roman" w:hAnsi="Times New Roman" w:cs="Times New Roman"/>
-          <w:sz w:val="20"/>
-        </w:rPr>
-      </w:pPr>
-    </w:p>
-    <w:p vyd:_id="vyd:000000000001n3">
-      <w:pPr>
-        <w:pStyle w:val="Normal"/>
-        <w:spacing w:lineRule="auto" w:line="240" w:before="0" w:after="0"/>
-        <w:jc w:val="end"/>
-        <w:rPr>
-          <w:rFonts w:ascii="Times New Roman" w:hAnsi="Times New Roman" w:cs="Times New Roman"/>
-          <w:sz w:val="20"/>
-        </w:rPr>
-      </w:pPr>
-    </w:p>
     <w:p vyd:_id="vyd:000000000001n2">
       <w:pPr>
         <w:pStyle w:val="Normal"/>
@@ -7410,6 +7371,13 @@
                 <w:szCs w:val="24"/>
               </w:rPr>
             </w:pPr>
+            <w:r>
+              <w:rPr>
+                <w:rFonts w:ascii="Times New Roman" w:hAnsi="Times New Roman" w:cs="Times New Roman"/>
+                <w:sz w:val="24"/>
+              </w:rPr>
+              <w:t vyd:_id="vyd:movf3dsiadzs2j">Нахождение наибольшего и наименьшего значения функции на отрезке.</w:t>
+            </w:r>
           </w:p>
         </w:tc>
         <w:tc vyd:_id="vyd:000000000001k5">
@@ -7635,6 +7603,13 @@
                 <w:szCs w:val="24"/>
               </w:rPr>
             </w:pPr>
+            <w:r>
+              <w:rPr>
+                <w:rFonts w:ascii="Times New Roman" w:hAnsi="Times New Roman" w:cs="Times New Roman"/>
+                <w:sz w:val="24"/>
+              </w:rPr>
+              <w:t vyd:_id="vyd:movf51s7qpr1r8">Макс</w:t>
+            </w:r>
           </w:p>
         </w:tc>
         <w:tc vyd:_id="vyd:000000000001jl">
@@ -7855,9 +7830,21 @@
               <w:rPr>
                 <w:rFonts w:ascii="Times New Roman" w:hAnsi="Times New Roman" w:cs="Times New Roman"/>
                 <w:sz w:val="24"/>
-                <w:szCs w:val="24"/>
-              </w:rPr>
-            </w:pPr>
+                <w:color w:val="000000"/>
+                <w:szCs w:val="24"/>
+              </w:rPr>
+            </w:pPr>
+            <w:r>
+              <w:rPr>
+                <w:rFonts w:ascii="Times New Roman" w:hAnsi="Times New Roman" w:eastAsia="Open Sans" w:cs="Open Sans"/>
+                <w:sz w:val="24"/>
+                <w:color w:val="000000"/>
+                <w:b w:val="0"/>
+                <w:i w:val="0"/>
+                <w:shd w:val="clear" w:fill="FFFFFF"/>
+              </w:rPr>
+              <w:t vyd:_id="vyd:movf4ir939fr5j">Решение задач по теме</w:t>
+            </w:r>
           </w:p>
         </w:tc>
         <w:tc vyd:_id="vyd:000000000001j1">
@@ -8387,6 +8374,13 @@
                 <w:szCs w:val="24"/>
               </w:rPr>
             </w:pPr>
+            <w:r>
+              <w:rPr>
+                <w:rFonts w:ascii="Times New Roman" w:hAnsi="Times New Roman" w:cs="Times New Roman"/>
+                <w:sz w:val="24"/>
+              </w:rPr>
+              <w:t vyd:_id="vyd:movf3gboecsykv">Нахождение наибольшего и наименьшего значения функции на отрезке.</w:t>
+            </w:r>
           </w:p>
         </w:tc>
         <w:tc vyd:_id="vyd:000000000001hl">
@@ -8611,6 +8605,13 @@
                 <w:szCs w:val="24"/>
               </w:rPr>
             </w:pPr>
+            <w:r>
+              <w:rPr>
+                <w:rFonts w:ascii="Times New Roman" w:hAnsi="Times New Roman" w:cs="Times New Roman"/>
+                <w:sz w:val="24"/>
+              </w:rPr>
+              <w:t vyd:_id="vyd:movf53z79us594">Макс</w:t>
+            </w:r>
           </w:p>
         </w:tc>
         <w:tc vyd:_id="vyd:000000000001h1">
@@ -8826,14 +8827,24 @@
           <w:p vyd:_id="vyd:000000000001gk">
             <w:pPr>
               <w:pStyle w:val="Normal"/>
-              <w:snapToGrid w:val="0"/>
-              <w:spacing w:lineRule="auto" w:line="240" w:before="0" w:after="0"/>
-              <w:rPr>
-                <w:rFonts w:ascii="Times New Roman" w:hAnsi="Times New Roman" w:cs="Times New Roman"/>
-                <w:sz w:val="24"/>
-                <w:szCs w:val="24"/>
-              </w:rPr>
-            </w:pPr>
+              <w:spacing w:lineRule="auto" w:line="240" w:before="0" w:after="0"/>
+              <w:rPr>
+                <w:rFonts w:ascii="Times New Roman" w:hAnsi="Times New Roman" w:cs="Times New Roman"/>
+                <w:sz w:val="24"/>
+                <w:szCs w:val="24"/>
+              </w:rPr>
+            </w:pPr>
+            <w:r>
+              <w:rPr>
+                <w:rFonts w:ascii="Times New Roman" w:hAnsi="Times New Roman" w:eastAsia="Open Sans" w:cs="Open Sans"/>
+                <w:sz w:val="24"/>
+                <w:color w:val="000000"/>
+                <w:b w:val="0"/>
+                <w:i w:val="0"/>
+                <w:shd w:val="clear" w:fill="FFFFFF"/>
+              </w:rPr>
+              <w:t vyd:_id="vyd:movf4x6usfi9b7">Решение задач по теме</w:t>
+            </w:r>
           </w:p>
         </w:tc>
         <w:tc vyd:_id="vyd:000000000001gh">
@@ -9415,11 +9426,77 @@
               <w:snapToGrid w:val="0"/>
               <w:spacing w:lineRule="auto" w:line="240" w:before="0" w:after="0"/>
               <w:rPr>
-                <w:rFonts w:ascii="Times New Roman" w:hAnsi="Times New Roman" w:cs="Times New Roman"/>
-                <w:sz w:val="24"/>
-                <w:szCs w:val="24"/>
-              </w:rPr>
-            </w:pPr>
+                <w:rFonts w:ascii="Times New Roman" w:hAnsi="Times New Roman" w:eastAsia="Times New Roman" w:cs="Times New Roman"/>
+                <w:sz w:val="20"/>
+              </w:rPr>
+            </w:pPr>
+            <w:r>
+              <w:rPr>
+                <w:rFonts w:ascii="Times New Roman" w:hAnsi="Times New Roman" w:eastAsia="Times New Roman" w:cs="Times New Roman"/>
+                <w:sz w:val="20"/>
+              </w:rPr>
+              <w:t vyd:_id="vyd:movf145qdyuj8t">Различие между</w:t>
+            </w:r>
+            <w:r>
+              <w:rPr>
+                <w:rFonts w:ascii="Times New Roman" w:hAnsi="Times New Roman" w:eastAsia="Times New Roman" w:cs="Times New Roman"/>
+                <w:sz w:val="20"/>
+              </w:rPr>
+              <w:t vyd:_id="vyd:movf145qjgpu6s" xml:space="preserve">  </w:t>
+            </w:r>
+            <w:r>
+              <w:rPr>
+                <w:rFonts w:ascii="Times New Roman" w:hAnsi="Times New Roman" w:eastAsia="Times New Roman" w:cs="Times New Roman"/>
+                <w:sz w:val="20"/>
+              </w:rPr>
+              <w:t vyd:_id="vyd:movf145p3ymgv0">проектной и исследовательской</w:t>
+            </w:r>
+            <w:r>
+              <w:rPr>
+                <w:rFonts w:ascii="Times New Roman" w:hAnsi="Times New Roman" w:eastAsia="Times New Roman" w:cs="Times New Roman"/>
+                <w:sz w:val="20"/>
+              </w:rPr>
+              <w:t vyd:_id="vyd:movf145oyalgks" xml:space="preserve">  </w:t>
+            </w:r>
+            <w:r>
+              <w:rPr>
+                <w:rFonts w:ascii="Times New Roman" w:hAnsi="Times New Roman" w:eastAsia="Times New Roman" w:cs="Times New Roman"/>
+                <w:sz w:val="20"/>
+              </w:rPr>
+              <w:t vyd:_id="vyd:movf145mtxqitz">деятельностью</w:t>
+            </w:r>
+          </w:p>
+          <w:p vyd:_id="vyd:movf1no929ug3h">
+            <w:pPr>
+              <w:pStyle w:val="Normal"/>
+              <w:snapToGrid w:val="0"/>
+              <w:spacing w:lineRule="auto" w:line="240" w:before="0" w:after="0"/>
+              <w:rPr>
+                <w:rFonts w:ascii="Times New Roman" w:hAnsi="Times New Roman" w:eastAsia="Times New Roman" w:cs="Times New Roman"/>
+                <w:sz w:val="20"/>
+              </w:rPr>
+            </w:pPr>
+            <w:r>
+              <w:rPr>
+                <w:rFonts w:ascii="Times New Roman" w:hAnsi="Times New Roman" w:eastAsia="Times New Roman" w:cs="Times New Roman"/>
+                <w:sz w:val="20"/>
+              </w:rPr>
+              <w:t vyd:_id="vyd:movf1obcv5y65q">Понимание различия между разными</w:t>
+            </w:r>
+            <w:r>
+              <w:rPr>
+                <w:rFonts w:ascii="Times New Roman" w:hAnsi="Times New Roman" w:eastAsia="Times New Roman" w:cs="Times New Roman"/>
+                <w:sz w:val="20"/>
+              </w:rPr>
+              <w:t vyd:_id="vyd:movf1obc09svcy" xml:space="preserve">  </w:t>
+            </w:r>
+            <w:r>
+              <w:rPr>
+                <w:rFonts w:ascii="Times New Roman" w:hAnsi="Times New Roman" w:eastAsia="Times New Roman" w:cs="Times New Roman"/>
+                <w:sz w:val="20"/>
+              </w:rPr>
+              <w:t vyd:_id="vyd:movf1obb95cd2r">типами проектов</w:t>
+            </w:r>
           </w:p>
         </w:tc>
         <w:tc vyd:_id="vyd:000000000001ex">
@@ -9640,6 +9717,13 @@
                 <w:szCs w:val="24"/>
               </w:rPr>
             </w:pPr>
+            <w:r>
+              <w:rPr>
+                <w:rFonts w:ascii="Times New Roman" w:hAnsi="Times New Roman" w:cs="Times New Roman"/>
+                <w:sz w:val="24"/>
+              </w:rPr>
+              <w:t vyd:_id="vyd:movf18dth8pd86">Макс</w:t>
+            </w:r>
           </w:p>
         </w:tc>
         <w:tc vyd:_id="vyd:000000000001ed">
@@ -10451,10 +10535,21 @@
               <w:rPr>
                 <w:rFonts w:ascii="Times New Roman" w:hAnsi="Times New Roman" w:cs="Times New Roman"/>
                 <w:sz w:val="24"/>
-                <w:color w:val="FF0000"/>
-                <w:szCs w:val="24"/>
-              </w:rPr>
-            </w:pPr>
+                <w:color w:val="000000"/>
+                <w:szCs w:val="24"/>
+              </w:rPr>
+            </w:pPr>
+            <w:r>
+              <w:rPr>
+                <w:rFonts w:ascii="Times New Roman" w:hAnsi="Times New Roman" w:eastAsia="Open Sans" w:cs="Open Sans"/>
+                <w:sz w:val="24"/>
+                <w:color w:val="000000"/>
+                <w:b w:val="0"/>
+                <w:i w:val="0"/>
+                <w:shd w:val="clear" w:fill="FFFFFF"/>
+              </w:rPr>
+              <w:t vyd:_id="vyd:movf5sq7rv3bzd">Производная функции</w:t>
+            </w:r>
           </w:p>
         </w:tc>
         <w:tc vyd:_id="vyd:000000000001c9">
@@ -10528,7 +10623,7 @@
       </w:tr>
       <w:tr vyd:_id="vyd:000000000001bk">
         <w:trPr>
-          <w:trHeight w:val="23" w:hRule="atLeast"/>
+          <w:trHeight w:val="256.59" w:hRule="atLeast"/>
         </w:trPr>
         <w:tc vyd:_id="vyd:000000000001c2">
           <w:tcPr>
@@ -10673,10 +10768,18 @@
               <w:rPr>
                 <w:rFonts w:ascii="Times New Roman" w:hAnsi="Times New Roman" w:cs="Times New Roman"/>
                 <w:sz w:val="24"/>
-                <w:color w:val="FF0000"/>
-                <w:szCs w:val="24"/>
-              </w:rPr>
-            </w:pPr>
+                <w:color w:val="000000"/>
+                <w:szCs w:val="24"/>
+              </w:rPr>
+            </w:pPr>
+            <w:r>
+              <w:rPr>
+                <w:rFonts w:ascii="Times New Roman" w:hAnsi="Times New Roman" w:cs="Times New Roman"/>
+                <w:sz w:val="24"/>
+                <w:color w:val="000000"/>
+              </w:rPr>
+              <w:t vyd:_id="vyd:movf60dfvxdy23">Макс</w:t>
+            </w:r>
           </w:p>
         </w:tc>
         <w:tc vyd:_id="vyd:000000000001bp">
@@ -10895,10 +10998,21 @@
               <w:rPr>
                 <w:rFonts w:ascii="Times New Roman" w:hAnsi="Times New Roman" w:cs="Times New Roman"/>
                 <w:sz w:val="24"/>
-                <w:color w:val="FF0000"/>
-                <w:szCs w:val="24"/>
-              </w:rPr>
-            </w:pPr>
+                <w:color w:val="000000"/>
+                <w:szCs w:val="24"/>
+              </w:rPr>
+            </w:pPr>
+            <w:r>
+              <w:rPr>
+                <w:rFonts w:ascii="Times New Roman" w:hAnsi="Times New Roman" w:eastAsia="Open Sans" w:cs="Open Sans"/>
+                <w:sz w:val="24"/>
+                <w:color w:val="000000"/>
+                <w:b w:val="0"/>
+                <w:i w:val="0"/>
+                <w:shd w:val="clear" w:fill="FFFFFF"/>
+              </w:rPr>
+              <w:t vyd:_id="vyd:movf6nblmw8khq">Решение задач по теме</w:t>
+            </w:r>
           </w:p>
         </w:tc>
         <w:tc vyd:_id="vyd:000000000001b5">
@@ -11320,7 +11434,6 @@
           <w:p vyd:_id="vyd:000000000001a3">
             <w:pPr>
               <w:pStyle w:val="Normal"/>
-              <w:snapToGrid w:val="0"/>
               <w:spacing w:lineRule="auto" w:line="240" w:before="0" w:after="0"/>
               <w:rPr>
                 <w:rFonts w:ascii="Times New Roman" w:hAnsi="Times New Roman" w:cs="Times New Roman"/>
@@ -11329,6 +11442,17 @@
                 <w:szCs w:val="24"/>
               </w:rPr>
             </w:pPr>
+            <w:r>
+              <w:rPr>
+                <w:rFonts w:ascii="Times New Roman" w:hAnsi="Times New Roman" w:eastAsia="Open Sans" w:cs="Open Sans"/>
+                <w:sz w:val="24"/>
+                <w:color w:val="000000"/>
+                <w:b w:val="0"/>
+                <w:i w:val="0"/>
+                <w:shd w:val="clear" w:fill="FFFFFF"/>
+              </w:rPr>
+              <w:t vyd:_id="vyd:movf6a47trlv78">Производная функции</w:t>
+            </w:r>
           </w:p>
         </w:tc>
         <w:tc vyd:_id="vyd:000000000001a0">
@@ -11539,6 +11663,14 @@
                 <w:szCs w:val="24"/>
               </w:rPr>
             </w:pPr>
+            <w:r>
+              <w:rPr>
+                <w:rFonts w:ascii="Times New Roman" w:hAnsi="Times New Roman" w:cs="Times New Roman"/>
+                <w:sz w:val="24"/>
+                <w:color w:val="000000"/>
+              </w:rPr>
+              <w:t vyd:_id="vyd:movf6c8mixpsgl">Макс</w:t>
+            </w:r>
           </w:p>
         </w:tc>
         <w:tc vyd:_id="vyd:0000000000019g">
@@ -11740,7 +11872,6 @@
           <w:p vyd:_id="vyd:0000000000018z">
             <w:pPr>
               <w:pStyle w:val="Normal"/>
-              <w:snapToGrid w:val="0"/>
               <w:spacing w:lineRule="auto" w:line="240" w:before="0" w:after="0"/>
               <w:rPr>
                 <w:rFonts w:ascii="Times New Roman" w:hAnsi="Times New Roman" w:cs="Times New Roman"/>
@@ -11749,6 +11880,17 @@
                 <w:szCs w:val="24"/>
               </w:rPr>
             </w:pPr>
+            <w:r>
+              <w:rPr>
+                <w:rFonts w:ascii="Times New Roman" w:hAnsi="Times New Roman" w:eastAsia="Open Sans" w:cs="Open Sans"/>
+                <w:sz w:val="24"/>
+                <w:color w:val="000000"/>
+                <w:b w:val="0"/>
+                <w:i w:val="0"/>
+                <w:shd w:val="clear" w:fill="FFFFFF"/>
+              </w:rPr>
+              <w:t vyd:_id="vyd:movf6undd1vm8c">Решение задач по теме</w:t>
+            </w:r>
           </w:p>
         </w:tc>
         <w:tc vyd:_id="vyd:0000000000018w">
@@ -12202,12 +12344,63 @@
               <w:snapToGrid w:val="0"/>
               <w:spacing w:lineRule="auto" w:line="240" w:before="0" w:after="0"/>
               <w:rPr>
-                <w:rFonts w:ascii="Times New Roman" w:hAnsi="Times New Roman" w:cs="Times New Roman"/>
-                <w:sz w:val="24"/>
-                <w:color w:val="000000"/>
-                <w:szCs w:val="24"/>
-              </w:rPr>
-            </w:pPr>
+                <w:rFonts w:ascii="Times New Roman" w:hAnsi="Times New Roman" w:eastAsia="Times New Roman" w:cs="Times New Roman"/>
+                <w:sz w:val="20"/>
+              </w:rPr>
+            </w:pPr>
+            <w:r>
+              <w:rPr>
+                <w:rFonts w:ascii="Times New Roman" w:hAnsi="Times New Roman" w:eastAsia="Times New Roman" w:cs="Times New Roman"/>
+                <w:sz w:val="20"/>
+              </w:rPr>
+              <w:t vyd:_id="vyd:movf7bwz003f3t">Изучение методов, приемов,</w:t>
+            </w:r>
+            <w:r>
+              <w:rPr>
+                <w:rFonts w:ascii="Times New Roman" w:hAnsi="Times New Roman" w:eastAsia="Times New Roman" w:cs="Times New Roman"/>
+                <w:sz w:val="20"/>
+              </w:rPr>
+              <w:t vyd:_id="vyd:movf7bwyrrtdbd" xml:space="preserve">  </w:t>
+            </w:r>
+            <w:r>
+              <w:rPr>
+                <w:rFonts w:ascii="Times New Roman" w:hAnsi="Times New Roman" w:eastAsia="Times New Roman" w:cs="Times New Roman"/>
+                <w:sz w:val="20"/>
+              </w:rPr>
+              <w:t vyd:_id="vyd:movf7bwxtt69i3">технологии поиска и переработки информации.</w:t>
+            </w:r>
+          </w:p>
+          <w:p vyd:_id="vyd:movf7d9x1duqbk">
+            <w:pPr>
+              <w:pStyle w:val="Normal"/>
+              <w:snapToGrid w:val="0"/>
+              <w:spacing w:lineRule="auto" w:line="240" w:before="0" w:after="0"/>
+              <w:rPr>
+                <w:rFonts w:ascii="Times New Roman" w:hAnsi="Times New Roman" w:eastAsia="Times New Roman" w:cs="Times New Roman"/>
+                <w:sz w:val="20"/>
+              </w:rPr>
+            </w:pPr>
+            <w:r>
+              <w:rPr>
+                <w:rFonts w:ascii="Times New Roman" w:hAnsi="Times New Roman" w:eastAsia="Times New Roman" w:cs="Times New Roman"/>
+                <w:sz w:val="20"/>
+              </w:rPr>
+              <w:t vyd:_id="vyd:movf7n2wmcaing">Отбор и систематизация</w:t>
+            </w:r>
+            <w:r>
+              <w:rPr>
+                <w:rFonts w:ascii="Times New Roman" w:hAnsi="Times New Roman" w:eastAsia="Times New Roman" w:cs="Times New Roman"/>
+                <w:sz w:val="20"/>
+              </w:rPr>
+              <w:t vyd:_id="vyd:movf7n2wxw9xwv" xml:space="preserve">  </w:t>
+            </w:r>
+            <w:r>
+              <w:rPr>
+                <w:rFonts w:ascii="Times New Roman" w:hAnsi="Times New Roman" w:eastAsia="Times New Roman" w:cs="Times New Roman"/>
+                <w:sz w:val="20"/>
+              </w:rPr>
+              <w:t vyd:_id="vyd:movf7n2u7w26ma">информации. Рассмотрение видов переработки чужого текста</w:t>
+            </w:r>
           </w:p>
         </w:tc>
         <w:tc vyd:_id="vyd:0000000000017p">
@@ -12433,6 +12626,14 @@
                 <w:szCs w:val="24"/>
               </w:rPr>
             </w:pPr>
+            <w:r>
+              <w:rPr>
+                <w:rFonts w:ascii="Times New Roman" w:hAnsi="Times New Roman" w:cs="Times New Roman"/>
+                <w:sz w:val="24"/>
+                <w:color w:val="000000"/>
+              </w:rPr>
+              <w:t vyd:_id="vyd:movf7puteq8a1x">Макс</w:t>
+            </w:r>
           </w:p>
         </w:tc>
         <w:tc vyd:_id="vyd:00000000000175">
@@ -13970,6 +14171,7 @@
                 <w:rFonts w:ascii="Times New Roman" w:hAnsi="Times New Roman" w:cs="Times New Roman"/>
                 <w:sz w:val="24"/>
                 <w:color w:val="000000"/>
+                <w:b w:val="1"/>
                 <w:szCs w:val="24"/>
               </w:rPr>
             </w:pPr>
@@ -13996,6 +14198,14 @@
                 <w:szCs w:val="24"/>
               </w:rPr>
             </w:pPr>
+            <w:r>
+              <w:rPr>
+                <w:rFonts w:ascii="Times New Roman" w:hAnsi="Times New Roman" w:cs="Times New Roman"/>
+                <w:sz w:val="24"/>
+                <w:color w:val="000000"/>
+              </w:rPr>
+              <w:t vyd:_id="vyd:movbbj73tpevep">Электромагнитные колебания</w:t>
+            </w:r>
           </w:p>
         </w:tc>
         <w:tc vyd:_id="vyd:00000000000132">
@@ -14230,6 +14440,14 @@
                 <w:szCs w:val="24"/>
               </w:rPr>
             </w:pPr>
+            <w:r>
+              <w:rPr>
+                <w:rFonts w:ascii="Times New Roman" w:hAnsi="Times New Roman" w:cs="Times New Roman"/>
+                <w:sz w:val="24"/>
+                <w:color w:val="000000"/>
+              </w:rPr>
+              <w:t vyd:_id="vyd:movbbpegyrd68k">мах</w:t>
+            </w:r>
           </w:p>
         </w:tc>
         <w:tc vyd:_id="vyd:0000000000012i">
@@ -14464,6 +14682,14 @@
                 <w:szCs w:val="24"/>
               </w:rPr>
             </w:pPr>
+            <w:r>
+              <w:rPr>
+                <w:rFonts w:ascii="Times New Roman" w:hAnsi="Times New Roman" w:cs="Times New Roman"/>
+                <w:sz w:val="24"/>
+                <w:color w:val="000000"/>
+              </w:rPr>
+              <w:t vyd:_id="vyd:movbbsguvr3iut">конспект</w:t>
+            </w:r>
           </w:p>
         </w:tc>
         <w:tc vyd:_id="vyd:0000000000011y">
@@ -14972,6 +15198,14 @@
                 <w:szCs w:val="24"/>
               </w:rPr>
             </w:pPr>
+            <w:r>
+              <w:rPr>
+                <w:rFonts w:ascii="Times New Roman" w:hAnsi="Times New Roman" w:cs="Times New Roman"/>
+                <w:sz w:val="24"/>
+                <w:color w:val="000000"/>
+              </w:rPr>
+              <w:t vyd:_id="vyd:movbbybny0zauj">Электромагнитные волны</w:t>
+            </w:r>
           </w:p>
         </w:tc>
         <w:tc vyd:_id="vyd:0000000000010n">
@@ -15213,6 +15447,14 @@
                 <w:szCs w:val="24"/>
               </w:rPr>
             </w:pPr>
+            <w:r>
+              <w:rPr>
+                <w:rFonts w:ascii="Times New Roman" w:hAnsi="Times New Roman" w:cs="Times New Roman"/>
+                <w:sz w:val="24"/>
+                <w:color w:val="000000"/>
+              </w:rPr>
+              <w:t vyd:_id="vyd:movbc9giewolzq">мах</w:t>
+            </w:r>
           </w:p>
         </w:tc>
         <w:tc vyd:_id="vyd:00000000000103">
@@ -15447,6 +15689,14 @@
                 <w:szCs w:val="24"/>
               </w:rPr>
             </w:pPr>
+            <w:r>
+              <w:rPr>
+                <w:rFonts w:ascii="Times New Roman" w:hAnsi="Times New Roman" w:cs="Times New Roman"/>
+                <w:sz w:val="24"/>
+                <w:color w:val="000000"/>
+              </w:rPr>
+              <w:t vyd:_id="vyd:movbccn0r5y6qz">Решение задач</w:t>
+            </w:r>
           </w:p>
         </w:tc>
         <w:tc vyd:_id="vyd:000000000000zj">
@@ -16099,6 +16349,13 @@
                 <w:szCs w:val="24"/>
               </w:rPr>
             </w:pPr>
+            <w:r>
+              <w:rPr>
+                <w:rFonts w:ascii="Times New Roman" w:hAnsi="Times New Roman" w:cs="Times New Roman"/>
+                <w:sz w:val="24"/>
+              </w:rPr>
+              <w:t vyd:_id="vyd:movek9xrphvtry">Место и роль Зарубежной Европы в мире</w:t>
+            </w:r>
           </w:p>
         </w:tc>
         <w:tc vyd:_id="vyd:000000000000xw">
@@ -16121,6 +16378,14 @@
                 <w:szCs w:val="24"/>
               </w:rPr>
             </w:pPr>
+            <w:r>
+              <w:rPr>
+                <w:rFonts w:ascii="Times New Roman" w:hAnsi="Times New Roman" w:cs="Times New Roman"/>
+                <w:sz w:val="24"/>
+                <w:color w:val="000000"/>
+              </w:rPr>
+              <w:t vyd:_id="vyd:movbcod9owpcwk">Электромагнитные колебания</w:t>
+            </w:r>
           </w:p>
         </w:tc>
       </w:tr>
@@ -16334,6 +16599,13 @@
                 <w:szCs w:val="24"/>
               </w:rPr>
             </w:pPr>
+            <w:r>
+              <w:rPr>
+                <w:rFonts w:ascii="Times New Roman" w:hAnsi="Times New Roman" w:cs="Times New Roman"/>
+                <w:sz w:val="24"/>
+              </w:rPr>
+              <w:t vyd:_id="vyd:moveltj4qp4ls2">макс</w:t>
+            </w:r>
           </w:p>
         </w:tc>
         <w:tc vyd:_id="vyd:000000000000xc">
@@ -16356,6 +16628,13 @@
                 <w:szCs w:val="24"/>
               </w:rPr>
             </w:pPr>
+            <w:r>
+              <w:rPr>
+                <w:rFonts w:ascii="Times New Roman" w:hAnsi="Times New Roman" w:cs="Times New Roman"/>
+                <w:sz w:val="24"/>
+              </w:rPr>
+              <w:t vyd:_id="vyd:movbctmc6u00d4">мах</w:t>
+            </w:r>
           </w:p>
         </w:tc>
       </w:tr>
@@ -16569,6 +16848,13 @@
                 <w:szCs w:val="24"/>
               </w:rPr>
             </w:pPr>
+            <w:r>
+              <w:rPr>
+                <w:rFonts w:ascii="Times New Roman" w:hAnsi="Times New Roman" w:cs="Times New Roman"/>
+                <w:sz w:val="24"/>
+              </w:rPr>
+              <w:t vyd:_id="vyd:movembetq0vx66">Выполнить конспект</w:t>
+            </w:r>
           </w:p>
         </w:tc>
         <w:tc vyd:_id="vyd:000000000000ws">
@@ -16591,6 +16877,13 @@
                 <w:szCs w:val="24"/>
               </w:rPr>
             </w:pPr>
+            <w:r>
+              <w:rPr>
+                <w:rFonts w:ascii="Times New Roman" w:hAnsi="Times New Roman" w:cs="Times New Roman"/>
+                <w:sz w:val="24"/>
+              </w:rPr>
+              <w:t vyd:_id="vyd:movbcw7t6k4e0n">конспект</w:t>
+            </w:r>
           </w:p>
         </w:tc>
       </w:tr>
@@ -17119,6 +17412,13 @@
                 <w:szCs w:val="24"/>
               </w:rPr>
             </w:pPr>
+            <w:r>
+              <w:rPr>
+                <w:rFonts w:ascii="Times New Roman" w:hAnsi="Times New Roman" w:cs="Times New Roman"/>
+                <w:sz w:val="24"/>
+              </w:rPr>
+              <w:t vyd:_id="vyd:movekx1dm86a3g">Германия и Великобритания как ведущие страны Зарубежной Европы</w:t>
+            </w:r>
           </w:p>
         </w:tc>
         <w:tc vyd:_id="vyd:000000000000vd">
@@ -17141,6 +17441,14 @@
                 <w:szCs w:val="24"/>
               </w:rPr>
             </w:pPr>
+            <w:r>
+              <w:rPr>
+                <w:rFonts w:ascii="Times New Roman" w:hAnsi="Times New Roman" w:cs="Times New Roman"/>
+                <w:sz w:val="24"/>
+                <w:color w:val="000000"/>
+              </w:rPr>
+              <w:t vyd:_id="vyd:movbd0zmvihgnd">Электромагнитныеволны</w:t>
+            </w:r>
           </w:p>
         </w:tc>
       </w:tr>
@@ -17354,6 +17662,13 @@
                 <w:szCs w:val="24"/>
               </w:rPr>
             </w:pPr>
+            <w:r>
+              <w:rPr>
+                <w:rFonts w:ascii="Times New Roman" w:hAnsi="Times New Roman" w:cs="Times New Roman"/>
+                <w:sz w:val="24"/>
+              </w:rPr>
+              <w:t vyd:_id="vyd:movelxc9d91t6o">макс</w:t>
+            </w:r>
           </w:p>
         </w:tc>
         <w:tc vyd:_id="vyd:000000000000ut">
@@ -17376,6 +17691,13 @@
                 <w:szCs w:val="24"/>
               </w:rPr>
             </w:pPr>
+            <w:r>
+              <w:rPr>
+                <w:rFonts w:ascii="Times New Roman" w:hAnsi="Times New Roman" w:cs="Times New Roman"/>
+                <w:sz w:val="24"/>
+              </w:rPr>
+              <w:t vyd:_id="vyd:movbdenokv1cjr">Мах</w:t>
+            </w:r>
           </w:p>
         </w:tc>
       </w:tr>
@@ -17589,6 +17911,13 @@
                 <w:szCs w:val="24"/>
               </w:rPr>
             </w:pPr>
+            <w:r>
+              <w:rPr>
+                <w:rFonts w:ascii="Times New Roman" w:hAnsi="Times New Roman" w:cs="Times New Roman"/>
+                <w:sz w:val="24"/>
+              </w:rPr>
+              <w:t vyd:_id="vyd:movemlk80y6flv">Выполнить конспект</w:t>
+            </w:r>
           </w:p>
         </w:tc>
         <w:tc vyd:_id="vyd:000000000000u9">
@@ -17611,6 +17940,13 @@
                 <w:szCs w:val="24"/>
               </w:rPr>
             </w:pPr>
+            <w:r>
+              <w:rPr>
+                <w:rFonts w:ascii="Times New Roman" w:hAnsi="Times New Roman" w:cs="Times New Roman"/>
+                <w:sz w:val="24"/>
+              </w:rPr>
+              <w:t vyd:_id="vyd:movbe7dgpvxge1">Решение задач</w:t>
+            </w:r>
           </w:p>
         </w:tc>
       </w:tr>
@@ -18983,7 +19319,7 @@
                 <w:sz w:val="24"/>
                 <w:color w:val="000000"/>
               </w:rPr>
-              <w:t vyd:_id="vyd:movabcssh4dxfd" xml:space="preserve">Вычисление </w:t>
+              <w:t vyd:_id="vyd:movabcssh4dxfd">Вычисление элементов многогранника</w:t>
             </w:r>
           </w:p>
         </w:tc>
@@ -19202,6 +19538,14 @@
                 <w:szCs w:val="24"/>
               </w:rPr>
             </w:pPr>
+            <w:r>
+              <w:rPr>
+                <w:rFonts w:ascii="Times New Roman" w:hAnsi="Times New Roman" w:cs="Times New Roman"/>
+                <w:sz w:val="24"/>
+                <w:color w:val="000000"/>
+              </w:rPr>
+              <w:t vyd:_id="vyd:movabo10aa6s01">мах</w:t>
+            </w:r>
           </w:p>
         </w:tc>
       </w:tr>
@@ -19419,6 +19763,14 @@
                 <w:szCs w:val="24"/>
               </w:rPr>
             </w:pPr>
+            <w:r>
+              <w:rPr>
+                <w:rFonts w:ascii="Times New Roman" w:hAnsi="Times New Roman" w:cs="Times New Roman"/>
+                <w:sz w:val="24"/>
+                <w:color w:val="000000"/>
+              </w:rPr>
+              <w:t vyd:_id="vyd:movabrrhxxgl5u">Решение задач</w:t>
+            </w:r>
           </w:p>
         </w:tc>
       </w:tr>
@@ -19759,7 +20111,6 @@
     </w:p>
     <w:tbl vyd:_id="vyd:000000000000h0">
       <w:tblPr>
-        <w:tblW w:w="15281" w:type="dxa"/>
         <w:jc w:val="center"/>
         <w:tblInd w:w="0" w:type="dxa"/>
         <w:tblLayout w:type="fixed"/>
@@ -19774,8 +20125,8 @@
         <w:gridCol w:w="620"/>
         <w:gridCol w:w="1053"/>
         <w:gridCol w:w="3402"/>
-        <w:gridCol w:w="3402"/>
-        <w:gridCol w:w="3402"/>
+        <w:gridCol w:w="3389"/>
+        <w:gridCol w:w="3415"/>
         <w:gridCol w:w="3402"/>
       </w:tblGrid>
       <w:tr vyd:_id="vyd:000000000000o6">
@@ -20427,23 +20778,34 @@
         <w:tc vyd:_id="vyd:000000000000mx">
           <w:tcPr>
             <w:tcBorders>
-              <w:top w:val="single" w:color="000000" w:sz="4" w:space="0"/>
-              <w:start w:val="single" w:color="000000" w:sz="4" w:space="0"/>
-              <w:bottom w:val="single" w:color="000000" w:sz="4" w:space="0"/>
-              <w:end w:val="single" w:color="000000" w:sz="4" w:space="0"/>
-            </w:tcBorders>
+              <w:top w:val="single" w:sz="8"/>
+              <w:start w:val="single" w:sz="8"/>
+              <w:bottom w:val="single" w:sz="8"/>
+              <w:end w:val="single" w:sz="8"/>
+            </w:tcBorders>
+            <w:tcMar>
+              <w:top w:w="0" w:type="dxa"/>
+              <w:start w:w="108" w:type="dxa"/>
+              <w:bottom w:w="0" w:type="dxa"/>
+              <w:end w:w="108" w:type="dxa"/>
+            </w:tcMar>
           </w:tcPr>
           <w:p vyd:_id="vyd:000000000000my">
             <w:pPr>
-              <w:pStyle w:val="Normal"/>
-              <w:snapToGrid w:val="0"/>
-              <w:spacing w:lineRule="auto" w:line="240" w:before="0" w:after="0"/>
-              <w:rPr>
-                <w:rFonts w:ascii="Times New Roman" w:hAnsi="Times New Roman" w:cs="Times New Roman"/>
-                <w:sz w:val="20"/>
+              <w:spacing w:after="240"/>
+              <w:rPr>
+                <w:rFonts w:ascii="Times New Roman" w:hAnsi="Times New Roman" w:cs="Times New Roman"/>
+                <w:sz w:val="18"/>
                 <w:szCs w:val="20"/>
               </w:rPr>
             </w:pPr>
+            <w:r>
+              <w:rPr>
+                <w:sz w:val="22"/>
+                <w:shd w:val="clear" w:fill="FFFFFF"/>
+              </w:rPr>
+              <w:t vyd:_id="vyd:movcgt41y16m85">Расчёт операционных припусков и определение операционных размеров детали</w:t>
+            </w:r>
           </w:p>
         </w:tc>
         <w:tc vyd:_id="vyd:000000000000mv">
@@ -20587,15 +20949,20 @@
           </w:tcPr>
           <w:p vyd:_id="vyd:000000000000mk">
             <w:pPr>
-              <w:pStyle w:val="Normal"/>
-              <w:snapToGrid w:val="0"/>
-              <w:spacing w:lineRule="auto" w:line="240" w:before="0" w:after="0"/>
+              <w:spacing w:after="0" w:lineRule="auto" w:line="240" w:before="0"/>
               <w:rPr>
                 <w:rFonts w:ascii="Times New Roman" w:hAnsi="Times New Roman" w:cs="Times New Roman"/>
                 <w:sz w:val="20"/>
                 <w:szCs w:val="20"/>
               </w:rPr>
             </w:pPr>
+            <w:r>
+              <w:rPr>
+                <w:rFonts w:ascii="Times New Roman" w:hAnsi="Times New Roman" w:eastAsia="Times New Roman" w:cs="Times New Roman"/>
+                <w:sz w:val="20"/>
+              </w:rPr>
+              <w:t vyd:_id="vyd:movcnoxvnljx1p">МАКС</w:t>
+            </w:r>
           </w:p>
         </w:tc>
         <w:tc vyd:_id="vyd:000000000000mh">
@@ -20732,15 +21099,20 @@
           </w:tcPr>
           <w:p vyd:_id="vyd:000000000000m6">
             <w:pPr>
-              <w:pStyle w:val="Normal"/>
-              <w:snapToGrid w:val="0"/>
-              <w:spacing w:lineRule="auto" w:line="240" w:before="0" w:after="0"/>
-              <w:rPr>
-                <w:rFonts w:ascii="Times New Roman" w:hAnsi="Times New Roman" w:cs="Times New Roman"/>
+              <w:spacing w:after="0" w:lineRule="auto" w:line="240" w:before="0"/>
+              <w:rPr>
+                <w:rFonts w:ascii="Times New Roman" w:hAnsi="Times New Roman" w:cs="Times New Roman"/>
+                <w:sz w:val="18"/>
+                <w:szCs w:val="20"/>
+              </w:rPr>
+            </w:pPr>
+            <w:r>
+              <w:rPr>
+                <w:rFonts w:ascii="Times New Roman" w:hAnsi="Times New Roman" w:eastAsia="Times New Roman" w:cs="Times New Roman"/>
                 <w:sz w:val="20"/>
-                <w:szCs w:val="20"/>
-              </w:rPr>
-            </w:pPr>
+              </w:rPr>
+              <w:t vyd:_id="vyd:movcoiujb51vm7">Подготовить отчёт</w:t>
+            </w:r>
           </w:p>
         </w:tc>
         <w:tc vyd:_id="vyd:000000000000m3">
@@ -21083,23 +21455,34 @@
         <w:tc vyd:_id="vyd:000000000000l7">
           <w:tcPr>
             <w:tcBorders>
-              <w:top w:val="single" w:color="000000" w:sz="4" w:space="0"/>
-              <w:start w:val="single" w:color="000000" w:sz="4" w:space="0"/>
-              <w:bottom w:val="single" w:color="000000" w:sz="4" w:space="0"/>
-              <w:end w:val="single" w:color="000000" w:sz="4" w:space="0"/>
-            </w:tcBorders>
+              <w:top w:val="single" w:sz="8"/>
+              <w:start w:val="single" w:sz="8"/>
+              <w:bottom w:val="single" w:sz="8"/>
+              <w:end w:val="single" w:sz="8"/>
+            </w:tcBorders>
+            <w:tcMar>
+              <w:top w:w="0" w:type="dxa"/>
+              <w:start w:w="108" w:type="dxa"/>
+              <w:bottom w:w="0" w:type="dxa"/>
+              <w:end w:w="108" w:type="dxa"/>
+            </w:tcMar>
           </w:tcPr>
           <w:p vyd:_id="vyd:000000000000l8">
             <w:pPr>
-              <w:pStyle w:val="Normal"/>
-              <w:snapToGrid w:val="0"/>
-              <w:spacing w:lineRule="auto" w:line="240" w:before="0" w:after="0"/>
-              <w:rPr>
-                <w:rFonts w:ascii="Times New Roman" w:hAnsi="Times New Roman" w:cs="Times New Roman"/>
-                <w:sz w:val="20"/>
+              <w:spacing w:after="240"/>
+              <w:rPr>
+                <w:rFonts w:ascii="Times New Roman" w:hAnsi="Times New Roman" w:cs="Times New Roman"/>
+                <w:sz w:val="18"/>
                 <w:szCs w:val="20"/>
               </w:rPr>
             </w:pPr>
+            <w:r>
+              <w:rPr>
+                <w:sz w:val="22"/>
+                <w:shd w:val="clear" w:fill="FFFFFF"/>
+              </w:rPr>
+              <w:t vyd:_id="vyd:movchaph6cgx0f">Расчёт операционных припусков и определение операционных размеров детали</w:t>
+            </w:r>
           </w:p>
         </w:tc>
         <w:tc vyd:_id="vyd:000000000000l5">
@@ -21250,15 +21633,20 @@
           </w:tcPr>
           <w:p vyd:_id="vyd:000000000000ku">
             <w:pPr>
-              <w:pStyle w:val="Normal"/>
-              <w:snapToGrid w:val="0"/>
-              <w:spacing w:lineRule="auto" w:line="240" w:before="0" w:after="0"/>
+              <w:spacing w:after="0" w:lineRule="auto" w:line="240" w:before="0"/>
               <w:rPr>
                 <w:rFonts w:ascii="Times New Roman" w:hAnsi="Times New Roman" w:cs="Times New Roman"/>
                 <w:sz w:val="20"/>
                 <w:szCs w:val="20"/>
               </w:rPr>
             </w:pPr>
+            <w:r>
+              <w:rPr>
+                <w:rFonts w:ascii="Times New Roman" w:hAnsi="Times New Roman" w:eastAsia="Times New Roman" w:cs="Times New Roman"/>
+                <w:sz w:val="20"/>
+              </w:rPr>
+              <w:t vyd:_id="vyd:movcndhpvct45p">МАКС</w:t>
+            </w:r>
           </w:p>
         </w:tc>
         <w:tc vyd:_id="vyd:000000000000kr">
@@ -21404,6 +21792,13 @@
                 <w:szCs w:val="20"/>
               </w:rPr>
             </w:pPr>
+            <w:r>
+              <w:rPr>
+                <w:rFonts w:ascii="Times New Roman" w:hAnsi="Times New Roman" w:cs="Times New Roman"/>
+                <w:sz w:val="20"/>
+              </w:rPr>
+              <w:t vyd:_id="vyd:movcksx5l1539f">Подготовить отчёт</w:t>
+            </w:r>
           </w:p>
         </w:tc>
         <w:tc vyd:_id="vyd:000000000000kd">
@@ -21734,23 +22129,34 @@
         <w:tc vyd:_id="vyd:000000000000ji">
           <w:tcPr>
             <w:tcBorders>
-              <w:top w:val="single" w:color="000000" w:sz="4" w:space="0"/>
-              <w:start w:val="single" w:color="000000" w:sz="4" w:space="0"/>
-              <w:bottom w:val="single" w:color="000000" w:sz="4" w:space="0"/>
-              <w:end w:val="single" w:color="000000" w:sz="4" w:space="0"/>
-            </w:tcBorders>
+              <w:top w:val="single" w:sz="8"/>
+              <w:start w:val="single" w:sz="8"/>
+              <w:bottom w:val="single" w:sz="8"/>
+              <w:end w:val="single" w:sz="8"/>
+            </w:tcBorders>
+            <w:tcMar>
+              <w:top w:w="0" w:type="dxa"/>
+              <w:start w:w="108" w:type="dxa"/>
+              <w:bottom w:w="0" w:type="dxa"/>
+              <w:end w:w="108" w:type="dxa"/>
+            </w:tcMar>
           </w:tcPr>
           <w:p vyd:_id="vyd:000000000000jj">
             <w:pPr>
-              <w:pStyle w:val="Normal"/>
-              <w:snapToGrid w:val="0"/>
-              <w:spacing w:lineRule="auto" w:line="240" w:before="0" w:after="0"/>
-              <w:rPr>
-                <w:rFonts w:ascii="Times New Roman" w:hAnsi="Times New Roman" w:cs="Times New Roman"/>
-                <w:sz w:val="20"/>
+              <w:spacing w:after="240"/>
+              <w:rPr>
+                <w:rFonts w:ascii="Times New Roman" w:hAnsi="Times New Roman" w:cs="Times New Roman"/>
+                <w:sz w:val="18"/>
                 <w:szCs w:val="20"/>
               </w:rPr>
             </w:pPr>
+            <w:r>
+              <w:rPr>
+                <w:sz w:val="22"/>
+                <w:shd w:val="clear" w:fill="FFFFFF"/>
+              </w:rPr>
+              <w:t vyd:_id="vyd:movcibby9etn62">Расчёт операционных припусков и определение операционных размеров детали</w:t>
+            </w:r>
           </w:p>
         </w:tc>
         <w:tc vyd:_id="vyd:000000000000jg">
@@ -21901,15 +22307,20 @@
           </w:tcPr>
           <w:p vyd:_id="vyd:000000000000j5">
             <w:pPr>
-              <w:pStyle w:val="Normal"/>
-              <w:snapToGrid w:val="0"/>
-              <w:spacing w:lineRule="auto" w:line="240" w:before="0" w:after="0"/>
+              <w:spacing w:after="0" w:lineRule="auto" w:line="240" w:before="0"/>
               <w:rPr>
                 <w:rFonts w:ascii="Times New Roman" w:hAnsi="Times New Roman" w:cs="Times New Roman"/>
                 <w:sz w:val="20"/>
                 <w:szCs w:val="20"/>
               </w:rPr>
             </w:pPr>
+            <w:r>
+              <w:rPr>
+                <w:rFonts w:ascii="Times New Roman" w:hAnsi="Times New Roman" w:eastAsia="Times New Roman" w:cs="Times New Roman"/>
+                <w:sz w:val="20"/>
+              </w:rPr>
+              <w:t vyd:_id="vyd:movcmxnu0np6xb">МАКС</w:t>
+            </w:r>
           </w:p>
         </w:tc>
         <w:tc vyd:_id="vyd:000000000000j2">
@@ -22046,15 +22457,20 @@
           </w:tcPr>
           <w:p vyd:_id="vyd:000000000000ir">
             <w:pPr>
-              <w:pStyle w:val="Normal"/>
-              <w:snapToGrid w:val="0"/>
-              <w:spacing w:lineRule="auto" w:line="240" w:before="0" w:after="0"/>
+              <w:spacing w:after="0" w:lineRule="auto" w:line="240" w:before="0"/>
               <w:rPr>
                 <w:rFonts w:ascii="Times New Roman" w:hAnsi="Times New Roman" w:cs="Times New Roman"/>
                 <w:sz w:val="20"/>
                 <w:szCs w:val="20"/>
               </w:rPr>
             </w:pPr>
+            <w:r>
+              <w:rPr>
+                <w:rFonts w:ascii="Times New Roman" w:hAnsi="Times New Roman" w:eastAsia="Times New Roman" w:cs="Times New Roman"/>
+                <w:sz w:val="20"/>
+              </w:rPr>
+              <w:t vyd:_id="vyd:movclg55alc08u">Подготовить отчёт</w:t>
+            </w:r>
           </w:p>
         </w:tc>
         <w:tc vyd:_id="vyd:000000000000io">
@@ -22361,17 +22777,22 @@
         <w:tc vyd:_id="vyd:000000000000hw">
           <w:tcPr>
             <w:tcBorders>
-              <w:top w:val="single" w:color="000000" w:sz="4" w:space="0"/>
-              <w:start w:val="single" w:color="000000" w:sz="4" w:space="0"/>
-              <w:bottom w:val="single" w:color="000000" w:sz="4" w:space="0"/>
-              <w:end w:val="single" w:color="000000" w:sz="4" w:space="0"/>
-            </w:tcBorders>
+              <w:top w:val="single" w:sz="8"/>
+              <w:start w:val="single" w:sz="8"/>
+              <w:bottom w:val="single" w:sz="8"/>
+              <w:end w:val="single" w:sz="8"/>
+            </w:tcBorders>
+            <w:tcMar>
+              <w:top w:w="0" w:type="dxa"/>
+              <w:start w:w="108" w:type="dxa"/>
+              <w:bottom w:w="0" w:type="dxa"/>
+              <w:end w:w="108" w:type="dxa"/>
+            </w:tcMar>
           </w:tcPr>
           <w:p vyd:_id="vyd:000000000000hx">
             <w:pPr>
-              <w:pStyle w:val="Normal"/>
-              <w:snapToGrid w:val="0"/>
-              <w:spacing w:lineRule="auto" w:line="240" w:before="0" w:after="0"/>
+              <w:spacing w:after="240"/>
+              <w:ind w:end="424.8"/>
               <w:rPr>
                 <w:rFonts w:ascii="Times New Roman" w:hAnsi="Times New Roman" w:cs="Times New Roman"/>
                 <w:sz w:val="20"/>
@@ -22379,6 +22800,13 @@
                 <w:szCs w:val="20"/>
               </w:rPr>
             </w:pPr>
+            <w:r>
+              <w:rPr>
+                <w:sz w:val="22"/>
+                <w:shd w:val="clear" w:fill="FFFFFF"/>
+              </w:rPr>
+              <w:t vyd:_id="vyd:movciz8cot851e">Расчёт операционных припусков и определение операционных размеров детали</w:t>
+            </w:r>
           </w:p>
         </w:tc>
         <w:tc vyd:_id="vyd:000000000000hu">
@@ -22525,9 +22953,7 @@
           </w:tcPr>
           <w:p vyd:_id="vyd:000000000000hj">
             <w:pPr>
-              <w:pStyle w:val="Normal"/>
-              <w:snapToGrid w:val="0"/>
-              <w:spacing w:lineRule="auto" w:line="240" w:before="0" w:after="0"/>
+              <w:spacing w:after="0" w:lineRule="auto" w:line="240" w:before="0"/>
               <w:rPr>
                 <w:rFonts w:ascii="Times New Roman" w:hAnsi="Times New Roman" w:cs="Times New Roman"/>
                 <w:sz w:val="20"/>
@@ -22535,6 +22961,13 @@
                 <w:szCs w:val="20"/>
               </w:rPr>
             </w:pPr>
+            <w:r>
+              <w:rPr>
+                <w:rFonts w:ascii="Times New Roman" w:hAnsi="Times New Roman" w:eastAsia="Times New Roman" w:cs="Times New Roman"/>
+                <w:sz w:val="20"/>
+              </w:rPr>
+              <w:t vyd:_id="vyd:movcmc5o27ktsy">МАКС</w:t>
+            </w:r>
           </w:p>
         </w:tc>
         <w:tc vyd:_id="vyd:000000000000hg">
@@ -22674,9 +23107,7 @@
           </w:tcPr>
           <w:p vyd:_id="vyd:000000000000h5">
             <w:pPr>
-              <w:pStyle w:val="Normal"/>
-              <w:snapToGrid w:val="0"/>
-              <w:spacing w:lineRule="auto" w:line="240" w:before="0" w:after="0"/>
+              <w:spacing w:after="0" w:lineRule="auto" w:line="240" w:before="0"/>
               <w:rPr>
                 <w:rFonts w:ascii="Times New Roman" w:hAnsi="Times New Roman" w:cs="Times New Roman"/>
                 <w:sz w:val="24"/>
@@ -22684,6 +23115,13 @@
                 <w:szCs w:val="24"/>
               </w:rPr>
             </w:pPr>
+            <w:r>
+              <w:rPr>
+                <w:rFonts w:ascii="Times New Roman" w:hAnsi="Times New Roman" w:eastAsia="Times New Roman" w:cs="Times New Roman"/>
+                <w:sz w:val="20"/>
+              </w:rPr>
+              <w:t vyd:_id="vyd:movclozymv3t9r">Подготовить отчёт</w:t>
+            </w:r>
           </w:p>
         </w:tc>
         <w:tc vyd:_id="vyd:000000000000h2">
@@ -23233,6 +23671,13 @@
                 <w:szCs w:val="18"/>
               </w:rPr>
             </w:pPr>
+            <w:r>
+              <w:rPr>
+                <w:rFonts w:ascii="Times New Roman" w:hAnsi="Times New Roman" w:cs="Times New Roman"/>
+                <w:sz w:val="18"/>
+              </w:rPr>
+              <w:t vyd:_id="vyd:movafspyj3aszu">Фибролит</w:t>
+            </w:r>
           </w:p>
         </w:tc>
         <w:tc vyd:_id="vyd:000000000000fl">
@@ -23335,6 +23780,13 @@
                 <w:szCs w:val="18"/>
               </w:rPr>
             </w:pPr>
+            <w:r>
+              <w:rPr>
+                <w:rFonts w:ascii="Times New Roman" w:hAnsi="Times New Roman" w:cs="Times New Roman"/>
+                <w:sz w:val="18"/>
+              </w:rPr>
+              <w:t vyd:_id="vyd:movafytwnkx4nk">мах</w:t>
+            </w:r>
           </w:p>
         </w:tc>
         <w:tc vyd:_id="vyd:000000000000fb">
@@ -23437,6 +23889,13 @@
                 <w:szCs w:val="18"/>
               </w:rPr>
             </w:pPr>
+            <w:r>
+              <w:rPr>
+                <w:rFonts w:ascii="Times New Roman" w:hAnsi="Times New Roman" w:cs="Times New Roman"/>
+                <w:sz w:val="18"/>
+              </w:rPr>
+              <w:t vyd:_id="vyd:movag341mvtnn1">конспект</w:t>
+            </w:r>
           </w:p>
         </w:tc>
         <w:tc vyd:_id="vyd:000000000000f1">
@@ -23649,6 +24108,13 @@
                 <w:szCs w:val="18"/>
               </w:rPr>
             </w:pPr>
+            <w:r>
+              <w:rPr>
+                <w:rFonts w:ascii="Times New Roman" w:hAnsi="Times New Roman" w:cs="Times New Roman"/>
+                <w:sz w:val="18"/>
+              </w:rPr>
+              <w:t vyd:_id="vyd:movagc9m13ytp2">Цементно-стружечные плиты</w:t>
+            </w:r>
           </w:p>
         </w:tc>
         <w:tc vyd:_id="vyd:000000000000eg">
@@ -23750,6 +24216,13 @@
                 <w:szCs w:val="18"/>
               </w:rPr>
             </w:pPr>
+            <w:r>
+              <w:rPr>
+                <w:rFonts w:ascii="Times New Roman" w:hAnsi="Times New Roman" w:cs="Times New Roman"/>
+                <w:sz w:val="18"/>
+              </w:rPr>
+              <w:t vyd:_id="vyd:movagnm8ac1p55">мах</w:t>
+            </w:r>
           </w:p>
         </w:tc>
         <w:tc vyd:_id="vyd:000000000000e6">
@@ -23851,6 +24324,13 @@
                 <w:szCs w:val="18"/>
               </w:rPr>
             </w:pPr>
+            <w:r>
+              <w:rPr>
+                <w:rFonts w:ascii="Times New Roman" w:hAnsi="Times New Roman" w:cs="Times New Roman"/>
+                <w:sz w:val="18"/>
+              </w:rPr>
+              <w:t vyd:_id="vyd:movagqkw92njep">конспект</w:t>
+            </w:r>
           </w:p>
         </w:tc>
         <w:tc vyd:_id="vyd:000000000000dw">
@@ -24072,6 +24552,13 @@
                 <w:szCs w:val="18"/>
               </w:rPr>
             </w:pPr>
+            <w:r>
+              <w:rPr>
+                <w:rFonts w:ascii="Times New Roman" w:hAnsi="Times New Roman" w:cs="Times New Roman"/>
+                <w:sz w:val="18"/>
+              </w:rPr>
+              <w:t vyd:_id="vyd:movah06gh18yr9">Технология производства и оборудование материалов ЦСП</w:t>
+            </w:r>
           </w:p>
         </w:tc>
         <w:tc vyd:_id="vyd:000000000000da">
@@ -24173,6 +24660,13 @@
                 <w:szCs w:val="18"/>
               </w:rPr>
             </w:pPr>
+            <w:r>
+              <w:rPr>
+                <w:rFonts w:ascii="Times New Roman" w:hAnsi="Times New Roman" w:cs="Times New Roman"/>
+                <w:sz w:val="18"/>
+              </w:rPr>
+              <w:t vyd:_id="vyd:movahnbzjdpddp">мах</w:t>
+            </w:r>
           </w:p>
         </w:tc>
         <w:tc vyd:_id="vyd:000000000000d0">
@@ -24274,6 +24768,13 @@
                 <w:szCs w:val="18"/>
               </w:rPr>
             </w:pPr>
+            <w:r>
+              <w:rPr>
+                <w:rFonts w:ascii="Times New Roman" w:hAnsi="Times New Roman" w:cs="Times New Roman"/>
+                <w:sz w:val="18"/>
+              </w:rPr>
+              <w:t vyd:_id="vyd:movahr1fk4b535">конспект</w:t>
+            </w:r>
           </w:p>
         </w:tc>
         <w:tc vyd:_id="vyd:000000000000cq">
@@ -24493,6 +24994,13 @@
                 <w:szCs w:val="18"/>
               </w:rPr>
             </w:pPr>
+            <w:r>
+              <w:rPr>
+                <w:rFonts w:ascii="Times New Roman" w:hAnsi="Times New Roman" w:cs="Times New Roman"/>
+                <w:sz w:val="18"/>
+              </w:rPr>
+              <w:t vyd:_id="vyd:movak2z37bnp7u">Технико-механические показатели</w:t>
+            </w:r>
           </w:p>
         </w:tc>
         <w:tc vyd:_id="vyd:000000000000c4">
@@ -24594,6 +25102,13 @@
                 <w:szCs w:val="18"/>
               </w:rPr>
             </w:pPr>
+            <w:r>
+              <w:rPr>
+                <w:rFonts w:ascii="Times New Roman" w:hAnsi="Times New Roman" w:cs="Times New Roman"/>
+                <w:sz w:val="18"/>
+              </w:rPr>
+              <w:t vyd:_id="vyd:movakeo2tfpze3">мах</w:t>
+            </w:r>
           </w:p>
         </w:tc>
         <w:tc vyd:_id="vyd:000000000000bu">
@@ -24695,6 +25210,13 @@
                 <w:szCs w:val="18"/>
               </w:rPr>
             </w:pPr>
+            <w:r>
+              <w:rPr>
+                <w:rFonts w:ascii="Times New Roman" w:hAnsi="Times New Roman" w:cs="Times New Roman"/>
+                <w:sz w:val="18"/>
+              </w:rPr>
+              <w:t vyd:_id="vyd:moval1o248cmtz">конспект</w:t>
+            </w:r>
           </w:p>
         </w:tc>
         <w:tc vyd:_id="vyd:000000000000bk">
@@ -26004,7 +26526,7 @@
       </w:tr>
       <w:tr vyd:_id="vyd:0000000000007s">
         <w:trPr>
-          <w:trHeight w:val="280" w:hRule="atLeast"/>
+          <w:trHeight w:val="810.498" w:hRule="atLeast"/>
         </w:trPr>
         <w:tc vyd:_id="vyd:00000000000080">
           <w:tcPr>
@@ -26096,16 +26618,23 @@
               <w:spacing w:lineRule="auto" w:line="240" w:before="0" w:after="0"/>
               <w:rPr>
                 <w:rFonts w:ascii="Times New Roman" w:hAnsi="Times New Roman" w:cs="Times New Roman"/>
-                <w:sz w:val="16"/>
+                <w:sz w:val="10"/>
                 <w:szCs w:val="16"/>
               </w:rPr>
             </w:pPr>
+            <w:r>
+              <w:rPr>
+                <w:rFonts w:ascii="Times New Roman" w:hAnsi="Times New Roman" w:eastAsia="Times New Roman" w:cs="Times New Roman"/>
+                <w:sz w:val="18"/>
+              </w:rPr>
+              <w:t vyd:_id="vyd:movdrapd5iikwo">Составление и оформление маршрутной карты сборки поршня</w:t>
+            </w:r>
           </w:p>
         </w:tc>
       </w:tr>
       <w:tr vyd:_id="vyd:0000000000007i">
         <w:trPr>
-          <w:trHeight w:val="280" w:hRule="atLeast"/>
+          <w:trHeight w:val="240" w:hRule="atLeast"/>
         </w:trPr>
         <w:tc vyd:_id="vyd:0000000000007q">
           <w:tcPr>
@@ -26201,6 +26730,13 @@
                 <w:szCs w:val="16"/>
               </w:rPr>
             </w:pPr>
+            <w:r>
+              <w:rPr>
+                <w:rFonts w:ascii="Times New Roman" w:hAnsi="Times New Roman" w:cs="Times New Roman"/>
+                <w:sz w:val="16"/>
+              </w:rPr>
+              <w:t vyd:_id="vyd:movdskaijlyqxo">Мах</w:t>
+            </w:r>
           </w:p>
         </w:tc>
       </w:tr>
@@ -26302,6 +26838,13 @@
                 <w:szCs w:val="16"/>
               </w:rPr>
             </w:pPr>
+            <w:r>
+              <w:rPr>
+                <w:rFonts w:ascii="Times New Roman" w:hAnsi="Times New Roman" w:cs="Times New Roman"/>
+                <w:sz w:val="16"/>
+              </w:rPr>
+              <w:t vyd:_id="vyd:movdxe1rb10lia">Выполнить отчет</w:t>
+            </w:r>
           </w:p>
         </w:tc>
       </w:tr>
@@ -26417,7 +26960,7 @@
       </w:tr>
       <w:tr vyd:_id="vyd:0000000000006n">
         <w:trPr>
-          <w:trHeight w:val="23" w:hRule="atLeast"/>
+          <w:trHeight w:val="519.084" w:hRule="atLeast"/>
         </w:trPr>
         <w:tc vyd:_id="vyd:0000000000006v">
           <w:tcPr>
@@ -26503,6 +27046,22 @@
             </w:tcBorders>
           </w:tcPr>
           <w:p vyd:_id="vyd:0000000000006p">
+            <w:pPr>
+              <w:spacing w:after="0" w:lineRule="auto" w:line="240" w:before="0"/>
+              <w:rPr>
+                <w:rFonts w:ascii="Calibri" w:hAnsi="Calibri" w:eastAsia="Calibri" w:cs="Calibri"/>
+                <w:sz w:val="22"/>
+              </w:rPr>
+            </w:pPr>
+            <w:r>
+              <w:rPr>
+                <w:rFonts w:ascii="Times New Roman" w:hAnsi="Times New Roman" w:eastAsia="Times New Roman" w:cs="Times New Roman"/>
+                <w:sz w:val="18"/>
+              </w:rPr>
+              <w:t vyd:_id="vyd:movdvqyy5xghz0">Составление и оформление маршрутной карты сборки поршня</w:t>
+            </w:r>
+          </w:p>
+          <w:p vyd:_id="vyd:movdvqyeetnit5">
             <w:pPr>
               <w:pStyle w:val="Normal"/>
               <w:snapToGrid w:val="0"/>
@@ -26518,7 +27077,7 @@
       </w:tr>
       <w:tr vyd:_id="vyd:0000000000006d">
         <w:trPr>
-          <w:trHeight w:val="23" w:hRule="atLeast"/>
+          <w:trHeight w:val="272.132" w:hRule="atLeast"/>
         </w:trPr>
         <w:tc vyd:_id="vyd:0000000000006l">
           <w:tcPr>
@@ -26614,6 +27173,12 @@
                 <w:szCs w:val="16"/>
               </w:rPr>
             </w:pPr>
+            <w:r>
+              <w:rPr>
+                <w:sz w:val="16"/>
+              </w:rPr>
+              <w:t vyd:_id="vyd:movdtgft6txk0v">Мах</w:t>
+            </w:r>
           </w:p>
         </w:tc>
       </w:tr>
@@ -26715,6 +27280,13 @@
                 <w:szCs w:val="16"/>
               </w:rPr>
             </w:pPr>
+            <w:r>
+              <w:rPr>
+                <w:rFonts w:ascii="Times New Roman" w:hAnsi="Times New Roman" w:cs="Times New Roman"/>
+                <w:sz w:val="16"/>
+              </w:rPr>
+              <w:t vyd:_id="vyd:movdyb9997juj4">Выполнить отчет</w:t>
+            </w:r>
           </w:p>
         </w:tc>
       </w:tr>
@@ -26922,10 +27494,17 @@
               <w:spacing w:lineRule="auto" w:line="240" w:before="0" w:after="0"/>
               <w:rPr>
                 <w:rFonts w:ascii="Times New Roman" w:hAnsi="Times New Roman" w:cs="Times New Roman"/>
-                <w:sz w:val="16"/>
+                <w:sz w:val="12"/>
                 <w:szCs w:val="16"/>
               </w:rPr>
             </w:pPr>
+            <w:r>
+              <w:rPr>
+                <w:rFonts w:ascii="Times New Roman" w:hAnsi="Times New Roman" w:eastAsia="Times New Roman" w:cs="Times New Roman"/>
+                <w:sz w:val="20"/>
+              </w:rPr>
+              <w:t vyd:_id="vyd:movdrqeuekbgdn">Разработка и оформление операционной карты сборки изделия (по вариантам)</w:t>
+            </w:r>
           </w:p>
         </w:tc>
       </w:tr>
@@ -27027,12 +27606,19 @@
                 <w:szCs w:val="16"/>
               </w:rPr>
             </w:pPr>
+            <w:r>
+              <w:rPr>
+                <w:rFonts w:ascii="Times New Roman" w:hAnsi="Times New Roman" w:cs="Times New Roman"/>
+                <w:sz w:val="16"/>
+              </w:rPr>
+              <w:t vyd:_id="vyd:movdrwzpjg4s47">Мах</w:t>
+            </w:r>
           </w:p>
         </w:tc>
       </w:tr>
       <w:tr vyd:_id="vyd:0000000000004y">
         <w:trPr>
-          <w:trHeight w:val="23" w:hRule="atLeast"/>
+          <w:trHeight w:val="278.08" w:hRule="atLeast"/>
         </w:trPr>
         <w:tc vyd:_id="vyd:00000000000056">
           <w:tcPr>
@@ -27128,6 +27714,13 @@
                 <w:szCs w:val="16"/>
               </w:rPr>
             </w:pPr>
+            <w:r>
+              <w:rPr>
+                <w:rFonts w:ascii="Times New Roman" w:hAnsi="Times New Roman" w:cs="Times New Roman"/>
+                <w:sz w:val="16"/>
+              </w:rPr>
+              <w:t vyd:_id="vyd:movdyim7hctud6">Выполнить отчет</w:t>
+            </w:r>
           </w:p>
         </w:tc>
       </w:tr>
@@ -27243,7 +27836,7 @@
       </w:tr>
       <w:tr vyd:_id="vyd:0000000000004d">
         <w:trPr>
-          <w:trHeight w:val="23" w:hRule="atLeast"/>
+          <w:trHeight w:val="243.14" w:hRule="atLeast"/>
         </w:trPr>
         <w:tc vyd:_id="vyd:0000000000004l">
           <w:tcPr>
@@ -27313,10 +27906,17 @@
               <w:spacing w:lineRule="auto" w:line="240" w:before="0" w:after="0"/>
               <w:rPr>
                 <w:rFonts w:ascii="Times New Roman" w:hAnsi="Times New Roman" w:cs="Times New Roman"/>
-                <w:sz w:val="16"/>
+                <w:sz w:val="14"/>
                 <w:szCs w:val="16"/>
               </w:rPr>
             </w:pPr>
+            <w:r>
+              <w:rPr>
+                <w:rFonts w:ascii="Times New Roman" w:hAnsi="Times New Roman" w:eastAsia="Times New Roman" w:cs="Times New Roman"/>
+                <w:sz w:val="18"/>
+              </w:rPr>
+              <w:t vyd:_id="vyd:move0qx0u6agzq">Разработка и оформление операционной карты сборки изделия (по вариантам)</w:t>
+            </w:r>
           </w:p>
         </w:tc>
         <w:tc vyd:_id="vyd:0000000000004e">
@@ -27418,6 +28018,12 @@
                 <w:szCs w:val="16"/>
               </w:rPr>
             </w:pPr>
+            <w:r>
+              <w:rPr>
+                <w:sz w:val="16"/>
+              </w:rPr>
+              <w:t vyd:_id="vyd:movdtlho10r9c0">Мах</w:t>
+            </w:r>
           </w:p>
         </w:tc>
         <w:tc vyd:_id="vyd:00000000000044">
@@ -27510,6 +28116,22 @@
           </w:tcPr>
           <w:p vyd:_id="vyd:0000000000003x">
             <w:pPr>
+              <w:spacing w:after="0" w:lineRule="auto" w:line="240" w:before="0"/>
+              <w:rPr>
+                <w:rFonts w:ascii="Calibri" w:hAnsi="Calibri" w:eastAsia="Calibri" w:cs="Calibri"/>
+                <w:sz w:val="22"/>
+              </w:rPr>
+            </w:pPr>
+            <w:r>
+              <w:rPr>
+                <w:rFonts w:ascii="Times New Roman" w:hAnsi="Times New Roman" w:eastAsia="Times New Roman" w:cs="Times New Roman"/>
+                <w:sz w:val="16"/>
+              </w:rPr>
+              <w:t vyd:_id="vyd:move3ncc570j98">Выполнить отчет</w:t>
+            </w:r>
+          </w:p>
+          <w:p vyd:_id="vyd:move3nbewujoqy">
+            <w:pPr>
               <w:pStyle w:val="Normal"/>
               <w:snapToGrid w:val="0"/>
               <w:spacing w:lineRule="auto" w:line="240" w:before="0" w:after="0"/>
@@ -27726,10 +28348,17 @@
               <w:spacing w:lineRule="auto" w:line="240" w:before="0" w:after="0"/>
               <w:rPr>
                 <w:rFonts w:ascii="Times New Roman" w:hAnsi="Times New Roman" w:cs="Times New Roman"/>
-                <w:sz w:val="16"/>
+                <w:sz w:val="10"/>
                 <w:szCs w:val="16"/>
               </w:rPr>
             </w:pPr>
+            <w:r>
+              <w:rPr>
+                <w:rFonts w:ascii="Times New Roman" w:hAnsi="Times New Roman" w:eastAsia="Times New Roman" w:cs="Times New Roman"/>
+                <w:sz w:val="18"/>
+              </w:rPr>
+              <w:t vyd:_id="vyd:move268llnbyha">Разработка и оформление комплектовочной карты сборки изделия (по вариантам)</w:t>
+            </w:r>
           </w:p>
         </w:tc>
         <w:tc vyd:_id="vyd:00000000000039">
@@ -27757,7 +28386,7 @@
       </w:tr>
       <w:tr vyd:_id="vyd:0000000000002y">
         <w:trPr>
-          <w:trHeight w:val="23" w:hRule="atLeast"/>
+          <w:trHeight w:val="222.236" w:hRule="atLeast"/>
         </w:trPr>
         <w:tc vyd:_id="vyd:00000000000036">
           <w:tcPr>
@@ -27831,6 +28460,12 @@
                 <w:szCs w:val="16"/>
               </w:rPr>
             </w:pPr>
+            <w:r>
+              <w:rPr>
+                <w:sz w:val="16"/>
+              </w:rPr>
+              <w:t vyd:_id="vyd:movdtp24fud9jn">Мах</w:t>
+            </w:r>
           </w:p>
         </w:tc>
         <w:tc vyd:_id="vyd:0000000000002z">
@@ -27923,6 +28558,22 @@
           </w:tcPr>
           <w:p vyd:_id="vyd:0000000000002s">
             <w:pPr>
+              <w:spacing w:after="0" w:lineRule="auto" w:line="240" w:before="0"/>
+              <w:rPr>
+                <w:rFonts w:ascii="Calibri" w:hAnsi="Calibri" w:eastAsia="Calibri" w:cs="Calibri"/>
+                <w:sz w:val="22"/>
+              </w:rPr>
+            </w:pPr>
+            <w:r>
+              <w:rPr>
+                <w:rFonts w:ascii="Times New Roman" w:hAnsi="Times New Roman" w:eastAsia="Times New Roman" w:cs="Times New Roman"/>
+                <w:sz w:val="16"/>
+              </w:rPr>
+              <w:t vyd:_id="vyd:move3q3xim6pbw">Выполнить отчет</w:t>
+            </w:r>
+          </w:p>
+          <w:p vyd:_id="vyd:move3q3sws1595">
+            <w:pPr>
               <w:pStyle w:val="Normal"/>
               <w:snapToGrid w:val="0"/>
               <w:spacing w:lineRule="auto" w:line="240" w:before="0" w:after="0"/>
@@ -28135,15 +28786,20 @@
           </w:tcPr>
           <w:p vyd:_id="vyd:00000000000027">
             <w:pPr>
-              <w:pStyle w:val="Normal"/>
-              <w:snapToGrid w:val="0"/>
-              <w:spacing w:lineRule="auto" w:line="240" w:before="0" w:after="0"/>
+              <w:spacing w:after="0" w:lineRule="auto" w:line="240" w:before="0"/>
               <w:rPr>
                 <w:rFonts w:ascii="Times New Roman" w:hAnsi="Times New Roman" w:cs="Times New Roman"/>
                 <w:sz w:val="16"/>
                 <w:szCs w:val="16"/>
               </w:rPr>
             </w:pPr>
+            <w:r>
+              <w:rPr>
+                <w:rFonts w:ascii="Times New Roman" w:hAnsi="Times New Roman" w:eastAsia="Times New Roman" w:cs="Times New Roman"/>
+                <w:sz w:val="18"/>
+              </w:rPr>
+              <w:t vyd:_id="vyd:move2hv1xzkcp8">Разработка и оформление комплектовочной карты сборки изделия (по вариантам)</w:t>
+            </w:r>
           </w:p>
         </w:tc>
         <w:tc vyd:_id="vyd:00000000000024">
@@ -28246,6 +28902,12 @@
                 <w:szCs w:val="16"/>
               </w:rPr>
             </w:pPr>
+            <w:r>
+              <w:rPr>
+                <w:sz w:val="16"/>
+              </w:rPr>
+              <w:t vyd:_id="vyd:movdts0p0ucsm2">Мах</w:t>
+            </w:r>
           </w:p>
         </w:tc>
         <w:tc vyd:_id="vyd:0000000000001u">
@@ -28371,6 +29033,22 @@
           </w:tcPr>
           <w:p vyd:_id="vyd:0000000000001k">
             <w:pPr>
+              <w:spacing w:after="0" w:lineRule="auto" w:line="240" w:before="0"/>
+              <w:rPr>
+                <w:rFonts w:ascii="Calibri" w:hAnsi="Calibri" w:eastAsia="Calibri" w:cs="Calibri"/>
+                <w:sz w:val="22"/>
+              </w:rPr>
+            </w:pPr>
+            <w:r>
+              <w:rPr>
+                <w:rFonts w:ascii="Times New Roman" w:hAnsi="Times New Roman" w:eastAsia="Times New Roman" w:cs="Times New Roman"/>
+                <w:sz w:val="16"/>
+              </w:rPr>
+              <w:t vyd:_id="vyd:move3to013sxev">Выполнить отчет</w:t>
+            </w:r>
+          </w:p>
+          <w:p vyd:_id="vyd:move3tnvy0laxf">
+            <w:pPr>
               <w:pStyle w:val="Normal"/>
               <w:snapToGrid w:val="0"/>
               <w:spacing w:lineRule="auto" w:line="240" w:before="0" w:after="0"/>
@@ -28518,7 +29196,7 @@
       </w:tr>
       <w:tr vyd:_id="vyd:0000000000000v">
         <w:trPr>
-          <w:trHeight w:val="23" w:hRule="atLeast"/>
+          <w:trHeight w:val="226.568" w:hRule="atLeast"/>
         </w:trPr>
         <w:tc vyd:_id="vyd:00000000000013">
           <w:tcPr>
@@ -28589,10 +29267,17 @@
               <w:spacing w:lineRule="auto" w:line="240" w:before="0" w:after="0"/>
               <w:rPr>
                 <w:rFonts w:ascii="Times New Roman" w:hAnsi="Times New Roman" w:cs="Times New Roman"/>
-                <w:sz w:val="16"/>
+                <w:sz w:val="10"/>
                 <w:szCs w:val="16"/>
               </w:rPr>
             </w:pPr>
+            <w:r>
+              <w:rPr>
+                <w:rFonts w:ascii="Times New Roman" w:hAnsi="Times New Roman" w:eastAsia="Times New Roman" w:cs="Times New Roman"/>
+                <w:sz w:val="18"/>
+              </w:rPr>
+              <w:t vyd:_id="vyd:move30timpvlad">Составление ведомости сборки кондуктора</w:t>
+            </w:r>
           </w:p>
         </w:tc>
         <w:tc vyd:_id="vyd:0000000000000w">
@@ -28695,6 +29380,12 @@
                 <w:szCs w:val="16"/>
               </w:rPr>
             </w:pPr>
+            <w:r>
+              <w:rPr>
+                <w:sz w:val="16"/>
+              </w:rPr>
+              <w:t vyd:_id="vyd:movdtuupt4id8v">Мах</w:t>
+            </w:r>
           </w:p>
         </w:tc>
         <w:tc vyd:_id="vyd:0000000000000m">
@@ -28787,6 +29478,22 @@
             </w:tcBorders>
           </w:tcPr>
           <w:p vyd:_id="vyd:0000000000000f">
+            <w:pPr>
+              <w:spacing w:after="0" w:lineRule="auto" w:line="240" w:before="0"/>
+              <w:rPr>
+                <w:rFonts w:ascii="Calibri" w:hAnsi="Calibri" w:eastAsia="Calibri" w:cs="Calibri"/>
+                <w:sz w:val="22"/>
+              </w:rPr>
+            </w:pPr>
+            <w:r>
+              <w:rPr>
+                <w:rFonts w:ascii="Times New Roman" w:hAnsi="Times New Roman" w:eastAsia="Times New Roman" w:cs="Times New Roman"/>
+                <w:sz w:val="16"/>
+              </w:rPr>
+              <w:t vyd:_id="vyd:move3wip66ru6l">Выполнить отчет</w:t>
+            </w:r>
+          </w:p>
+          <w:p vyd:_id="vyd:move3wimlzqu7u">
             <w:pPr>
               <w:pStyle w:val="Normal"/>
               <w:snapToGrid w:val="0"/>

</xml_diff>

<commit_message>
Sync schedule files 2026-05-07 14:07
</commit_message>
<xml_diff>
--- a/schedule/11.05.2026 ПОНЕДЕЛЬНИК.docx
+++ b/schedule/11.05.2026 ПОНЕДЕЛЬНИК.docx
@@ -1,6 +1,6 @@
 
 <file path=word/document.xml><?xml version="1.0" encoding="utf-8"?>
-<w:document xmlns:mc="http://schemas.openxmlformats.org/markup-compatibility/2006" xmlns:vyd="http://volga.yandex.com/schemas/document/model" xmlns:w="http://schemas.openxmlformats.org/wordprocessingml/2006/main" xmlns:r="http://schemas.openxmlformats.org/officeDocument/2006/relationships" w:conformance="transitional" mc:Ignorable="vyd">
+<w:document xmlns:r="http://schemas.openxmlformats.org/officeDocument/2006/relationships" xmlns:mc="http://schemas.openxmlformats.org/markup-compatibility/2006" xmlns:vyd="http://volga.yandex.com/schemas/document/model" xmlns:w="http://schemas.openxmlformats.org/wordprocessingml/2006/main" w:conformance="transitional" mc:Ignorable="vyd">
   <w:background w:color="FFFFFF"/>
   <w:body vyd:_id="vyd:00000000000001">
     <w:p vyd:_id="vyd:0000000000024d">
@@ -6243,50 +6243,6 @@
       </w:pPr>
     </w:p>
     <w:p vyd:_id="vyd:000000000001nc">
-      <w:pPr>
-        <w:pStyle w:val="Normal"/>
-        <w:spacing w:lineRule="auto" w:line="240" w:before="0" w:after="0"/>
-        <w:jc w:val="end"/>
-        <w:rPr>
-          <w:rFonts w:ascii="Times New Roman" w:hAnsi="Times New Roman" w:cs="Times New Roman"/>
-          <w:sz w:val="20"/>
-        </w:rPr>
-      </w:pPr>
-    </w:p>
-    <w:p vyd:_id="vyd:000000000001nb">
-      <w:pPr>
-        <w:pStyle w:val="Normal"/>
-        <w:spacing w:lineRule="auto" w:line="240" w:before="0" w:after="0"/>
-        <w:jc w:val="end"/>
-        <w:rPr>
-          <w:rFonts w:ascii="Times New Roman" w:hAnsi="Times New Roman" w:cs="Times New Roman"/>
-          <w:sz w:val="20"/>
-        </w:rPr>
-      </w:pPr>
-    </w:p>
-    <w:p vyd:_id="vyd:000000000001na">
-      <w:pPr>
-        <w:pStyle w:val="Normal"/>
-        <w:spacing w:lineRule="auto" w:line="240" w:before="0" w:after="0"/>
-        <w:jc w:val="end"/>
-        <w:rPr>
-          <w:rFonts w:ascii="Times New Roman" w:hAnsi="Times New Roman" w:cs="Times New Roman"/>
-          <w:sz w:val="20"/>
-        </w:rPr>
-      </w:pPr>
-    </w:p>
-    <w:p vyd:_id="vyd:000000000001n2">
-      <w:pPr>
-        <w:pStyle w:val="Normal"/>
-        <w:spacing w:lineRule="auto" w:line="240" w:before="0" w:after="0"/>
-        <w:jc w:val="end"/>
-        <w:rPr>
-          <w:rFonts w:ascii="Times New Roman" w:hAnsi="Times New Roman" w:cs="Times New Roman"/>
-          <w:sz w:val="20"/>
-        </w:rPr>
-      </w:pPr>
-    </w:p>
-    <w:p vyd:_id="vyd:000000000001n1">
       <w:pPr>
         <w:pStyle w:val="Normal"/>
         <w:spacing w:lineRule="auto" w:line="240" w:before="0" w:after="0"/>
@@ -13174,6 +13130,94 @@
         </w:rPr>
       </w:pPr>
     </w:p>
+    <w:p vyd:_id="vyd:movf8roa2ergyo">
+      <w:pPr>
+        <w:pStyle w:val="Normal"/>
+        <w:spacing w:lineRule="auto" w:line="240" w:before="0" w:after="0"/>
+        <w:jc w:val="end"/>
+        <w:rPr>
+          <w:rFonts w:ascii="Times New Roman" w:hAnsi="Times New Roman" w:cs="Times New Roman"/>
+          <w:sz w:val="20"/>
+        </w:rPr>
+      </w:pPr>
+    </w:p>
+    <w:p vyd:_id="vyd:movf8s1xdag4jv">
+      <w:pPr>
+        <w:pStyle w:val="Normal"/>
+        <w:spacing w:lineRule="auto" w:line="240" w:before="0" w:after="0"/>
+        <w:jc w:val="end"/>
+        <w:rPr>
+          <w:rFonts w:ascii="Times New Roman" w:hAnsi="Times New Roman" w:cs="Times New Roman"/>
+          <w:sz w:val="20"/>
+        </w:rPr>
+      </w:pPr>
+    </w:p>
+    <w:p vyd:_id="vyd:movf8semfaer4l">
+      <w:pPr>
+        <w:pStyle w:val="Normal"/>
+        <w:spacing w:lineRule="auto" w:line="240" w:before="0" w:after="0"/>
+        <w:jc w:val="end"/>
+        <w:rPr>
+          <w:rFonts w:ascii="Times New Roman" w:hAnsi="Times New Roman" w:cs="Times New Roman"/>
+          <w:sz w:val="20"/>
+        </w:rPr>
+      </w:pPr>
+    </w:p>
+    <w:p vyd:_id="vyd:movf8stakcun4d">
+      <w:pPr>
+        <w:pStyle w:val="Normal"/>
+        <w:spacing w:lineRule="auto" w:line="240" w:before="0" w:after="0"/>
+        <w:jc w:val="end"/>
+        <w:rPr>
+          <w:rFonts w:ascii="Times New Roman" w:hAnsi="Times New Roman" w:cs="Times New Roman"/>
+          <w:sz w:val="20"/>
+        </w:rPr>
+      </w:pPr>
+    </w:p>
+    <w:p vyd:_id="vyd:movf8t4etq9ccx">
+      <w:pPr>
+        <w:pStyle w:val="Normal"/>
+        <w:spacing w:lineRule="auto" w:line="240" w:before="0" w:after="0"/>
+        <w:jc w:val="end"/>
+        <w:rPr>
+          <w:rFonts w:ascii="Times New Roman" w:hAnsi="Times New Roman" w:cs="Times New Roman"/>
+          <w:sz w:val="20"/>
+        </w:rPr>
+      </w:pPr>
+    </w:p>
+    <w:p vyd:_id="vyd:movf8tica3gpao">
+      <w:pPr>
+        <w:pStyle w:val="Normal"/>
+        <w:spacing w:lineRule="auto" w:line="240" w:before="0" w:after="0"/>
+        <w:jc w:val="end"/>
+        <w:rPr>
+          <w:rFonts w:ascii="Times New Roman" w:hAnsi="Times New Roman" w:cs="Times New Roman"/>
+          <w:sz w:val="20"/>
+        </w:rPr>
+      </w:pPr>
+    </w:p>
+    <w:p vyd:_id="vyd:movf8tu7rvdezw">
+      <w:pPr>
+        <w:pStyle w:val="Normal"/>
+        <w:spacing w:lineRule="auto" w:line="240" w:before="0" w:after="0"/>
+        <w:jc w:val="end"/>
+        <w:rPr>
+          <w:rFonts w:ascii="Times New Roman" w:hAnsi="Times New Roman" w:cs="Times New Roman"/>
+          <w:sz w:val="20"/>
+        </w:rPr>
+      </w:pPr>
+    </w:p>
+    <w:p vyd:_id="vyd:movf8u7ujhkbi3">
+      <w:pPr>
+        <w:pStyle w:val="Normal"/>
+        <w:spacing w:lineRule="auto" w:line="240" w:before="0" w:after="0"/>
+        <w:jc w:val="end"/>
+        <w:rPr>
+          <w:rFonts w:ascii="Times New Roman" w:hAnsi="Times New Roman" w:cs="Times New Roman"/>
+          <w:sz w:val="20"/>
+        </w:rPr>
+      </w:pPr>
+    </w:p>
     <w:p vyd:_id="vyd:0000000000015q">
       <w:pPr>
         <w:pStyle w:val="Normal"/>
@@ -14167,14 +14211,22 @@
               <w:pStyle w:val="Normal"/>
               <w:snapToGrid w:val="0"/>
               <w:spacing w:lineRule="auto" w:line="240" w:before="0" w:after="0"/>
+              <w:jc w:val="start"/>
               <w:rPr>
                 <w:rFonts w:ascii="Times New Roman" w:hAnsi="Times New Roman" w:cs="Times New Roman"/>
                 <w:sz w:val="24"/>
                 <w:color w:val="000000"/>
-                <w:b w:val="1"/>
-                <w:szCs w:val="24"/>
-              </w:rPr>
-            </w:pPr>
+                <w:szCs w:val="24"/>
+              </w:rPr>
+            </w:pPr>
+            <w:r>
+              <w:rPr>
+                <w:rFonts w:ascii="Times New Roman" w:hAnsi="Times New Roman" w:cs="Times New Roman"/>
+                <w:sz w:val="24"/>
+                <w:color w:val="000000"/>
+              </w:rPr>
+              <w:t vyd:_id="vyd:movfeu0sfwcwjr">Выполнение заданий различных уровней сложности</w:t>
+            </w:r>
           </w:p>
         </w:tc>
         <w:tc vyd:_id="vyd:00000000000134">
@@ -14417,6 +14469,14 @@
                 <w:szCs w:val="24"/>
               </w:rPr>
             </w:pPr>
+            <w:r>
+              <w:rPr>
+                <w:rFonts w:ascii="Times New Roman" w:hAnsi="Times New Roman" w:cs="Times New Roman"/>
+                <w:sz w:val="24"/>
+                <w:color w:val="000000"/>
+              </w:rPr>
+              <w:t vyd:_id="vyd:movffmn5onjn9h">мах</w:t>
+            </w:r>
           </w:p>
         </w:tc>
         <w:tc vyd:_id="vyd:0000000000012k">
@@ -15175,6 +15235,14 @@
                 <w:szCs w:val="24"/>
               </w:rPr>
             </w:pPr>
+            <w:r>
+              <w:rPr>
+                <w:rFonts w:ascii="Times New Roman" w:hAnsi="Times New Roman" w:cs="Times New Roman"/>
+                <w:sz w:val="24"/>
+                <w:color w:val="000000"/>
+              </w:rPr>
+              <w:t vyd:_id="vyd:movffyyb51lmep">Выполнение заданиц различных уровнец сложностей</w:t>
+            </w:r>
           </w:p>
         </w:tc>
         <w:tc vyd:_id="vyd:0000000000010p">
@@ -15424,6 +15492,14 @@
                 <w:szCs w:val="24"/>
               </w:rPr>
             </w:pPr>
+            <w:r>
+              <w:rPr>
+                <w:rFonts w:ascii="Times New Roman" w:hAnsi="Times New Roman" w:cs="Times New Roman"/>
+                <w:sz w:val="24"/>
+                <w:color w:val="000000"/>
+              </w:rPr>
+              <w:t vyd:_id="vyd:movfgg90rphns4">мах</w:t>
+            </w:r>
           </w:p>
         </w:tc>
         <w:tc vyd:_id="vyd:00000000000105">
@@ -16246,6 +16322,14 @@
                 <w:szCs w:val="24"/>
               </w:rPr>
             </w:pPr>
+            <w:r>
+              <w:rPr>
+                <w:rFonts w:ascii="Times New Roman" w:hAnsi="Times New Roman" w:cs="Times New Roman"/>
+                <w:sz w:val="24"/>
+                <w:color w:val="000000"/>
+              </w:rPr>
+              <w:t vyd:_id="vyd:movfi5r0sjlld5">Выполнение заданий различнвз уровней сложности</w:t>
+            </w:r>
           </w:p>
         </w:tc>
         <w:tc vyd:_id="vyd:000000000000y4">
@@ -16495,6 +16579,14 @@
                 <w:szCs w:val="24"/>
               </w:rPr>
             </w:pPr>
+            <w:r>
+              <w:rPr>
+                <w:rFonts w:ascii="Times New Roman" w:hAnsi="Times New Roman" w:cs="Times New Roman"/>
+                <w:sz w:val="24"/>
+                <w:color w:val="000000"/>
+              </w:rPr>
+              <w:t vyd:_id="vyd:movfinymwsepmk">мах</w:t>
+            </w:r>
           </w:p>
         </w:tc>
         <w:tc vyd:_id="vyd:000000000000xk">
@@ -17304,6 +17396,14 @@
                 <w:szCs w:val="24"/>
               </w:rPr>
             </w:pPr>
+            <w:r>
+              <w:rPr>
+                <w:rFonts w:ascii="Times New Roman" w:hAnsi="Times New Roman" w:cs="Times New Roman"/>
+                <w:sz w:val="24"/>
+                <w:color w:val="000000"/>
+              </w:rPr>
+              <w:t vyd:_id="vyd:movfisij930jlu">Выполнение заданий различных уровней сложности</w:t>
+            </w:r>
           </w:p>
         </w:tc>
         <w:tc vyd:_id="vyd:000000000000vl">
@@ -17558,6 +17658,14 @@
                 <w:szCs w:val="24"/>
               </w:rPr>
             </w:pPr>
+            <w:r>
+              <w:rPr>
+                <w:rFonts w:ascii="Times New Roman" w:hAnsi="Times New Roman" w:cs="Times New Roman"/>
+                <w:sz w:val="24"/>
+                <w:color w:val="000000"/>
+              </w:rPr>
+              <w:t vyd:_id="vyd:movfj6rk6i63p8">мах</w:t>
+            </w:r>
           </w:p>
         </w:tc>
         <w:tc vyd:_id="vyd:000000000000v1">

</xml_diff>

<commit_message>
Sync schedule files 2026-05-07 16:50
</commit_message>
<xml_diff>
--- a/schedule/11.05.2026 ПОНЕДЕЛЬНИК.docx
+++ b/schedule/11.05.2026 ПОНЕДЕЛЬНИК.docx
@@ -20852,6 +20852,13 @@
                 <w:szCs w:val="20"/>
               </w:rPr>
             </w:pPr>
+            <w:r>
+              <w:rPr>
+                <w:rFonts w:ascii="Times New Roman" w:hAnsi="Times New Roman" w:cs="Times New Roman"/>
+                <w:sz w:val="20"/>
+              </w:rPr>
+              <w:t vyd:_id="vyd:movpe0d8rab87v">Оказание первой помощи при травмах</w:t>
+            </w:r>
           </w:p>
         </w:tc>
         <w:tc vyd:_id="vyd:000000000000mz">
@@ -21015,6 +21022,13 @@
                 <w:szCs w:val="20"/>
               </w:rPr>
             </w:pPr>
+            <w:r>
+              <w:rPr>
+                <w:rFonts w:ascii="Times New Roman" w:hAnsi="Times New Roman" w:cs="Times New Roman"/>
+                <w:sz w:val="20"/>
+              </w:rPr>
+              <w:t vyd:_id="vyd:movpdwf5m7nb14">Макс</w:t>
+            </w:r>
           </w:p>
         </w:tc>
         <w:tc vyd:_id="vyd:000000000000ml">
@@ -22862,17 +22876,21 @@
         <w:tc vyd:_id="vyd:000000000000hy">
           <w:tcPr>
             <w:tcBorders>
-              <w:top w:val="single" w:color="000000" w:sz="4" w:space="0"/>
-              <w:start w:val="single" w:color="000000" w:sz="4" w:space="0"/>
-              <w:bottom w:val="single" w:color="000000" w:sz="4" w:space="0"/>
-              <w:end w:val="single" w:color="000000" w:sz="4" w:space="0"/>
-            </w:tcBorders>
+              <w:top w:val="single" w:color="000000" w:sz="4"/>
+              <w:start w:val="single" w:color="000000" w:sz="4"/>
+              <w:bottom w:val="single" w:color="000000" w:sz="4"/>
+              <w:end w:val="single" w:color="000000" w:sz="4"/>
+            </w:tcBorders>
+            <w:tcMar>
+              <w:top w:w="60" w:type="dxa"/>
+              <w:start w:w="60" w:type="dxa"/>
+              <w:bottom w:w="60" w:type="dxa"/>
+              <w:end w:w="60" w:type="dxa"/>
+            </w:tcMar>
           </w:tcPr>
           <w:p vyd:_id="vyd:000000000000hz">
             <w:pPr>
-              <w:pStyle w:val="Normal"/>
-              <w:snapToGrid w:val="0"/>
-              <w:spacing w:lineRule="auto" w:line="240" w:before="0" w:after="0"/>
+              <w:spacing w:after="0" w:lineRule="auto" w:line="240" w:before="0"/>
               <w:rPr>
                 <w:rFonts w:ascii="Times New Roman" w:hAnsi="Times New Roman" w:cs="Times New Roman"/>
                 <w:sz w:val="20"/>
@@ -22880,6 +22898,20 @@
                 <w:szCs w:val="20"/>
               </w:rPr>
             </w:pPr>
+            <w:r>
+              <w:rPr>
+                <w:rFonts w:ascii="Calibri" w:hAnsi="Calibri" w:eastAsia="Calibri" w:cs="Calibri"/>
+                <w:sz w:val="22"/>
+              </w:rPr>
+              <w:t vyd:_id="vyd:movpeitkfqfnl5" xml:space="preserve"> </w:t>
+            </w:r>
+            <w:r>
+              <w:rPr>
+                <w:rFonts w:ascii="Times New Roman" w:hAnsi="Times New Roman" w:eastAsia="Times New Roman" w:cs="Times New Roman"/>
+                <w:sz w:val="20"/>
+              </w:rPr>
+              <w:t vyd:_id="vyd:movpeitk77uod4">Оказание первой помощи при травмах</w:t>
+            </w:r>
           </w:p>
         </w:tc>
         <w:tc vyd:_id="vyd:000000000000hw">
@@ -23048,6 +23080,14 @@
                 <w:szCs w:val="20"/>
               </w:rPr>
             </w:pPr>
+            <w:r>
+              <w:rPr>
+                <w:rFonts w:ascii="Times New Roman" w:hAnsi="Times New Roman" w:cs="Times New Roman"/>
+                <w:sz w:val="20"/>
+                <w:color w:val="FF0000"/>
+              </w:rPr>
+              <w:t vyd:_id="vyd:movpfpgvvci40i">Макс</w:t>
+            </w:r>
           </w:p>
         </w:tc>
         <w:tc vyd:_id="vyd:000000000000hi">

</xml_diff>

<commit_message>
Sync schedule files 2026-05-08 05:30
</commit_message>
<xml_diff>
--- a/schedule/11.05.2026 ПОНЕДЕЛЬНИК.docx
+++ b/schedule/11.05.2026 ПОНЕДЕЛЬНИК.docx
@@ -1,6 +1,6 @@
 
 <file path=word/document.xml><?xml version="1.0" encoding="utf-8"?>
-<w:document xmlns:r="http://schemas.openxmlformats.org/officeDocument/2006/relationships" xmlns:mc="http://schemas.openxmlformats.org/markup-compatibility/2006" xmlns:vyd="http://volga.yandex.com/schemas/document/model" xmlns:w="http://schemas.openxmlformats.org/wordprocessingml/2006/main" w:conformance="transitional" mc:Ignorable="vyd">
+<w:document xmlns:w="http://schemas.openxmlformats.org/wordprocessingml/2006/main" xmlns:vyd="http://volga.yandex.com/schemas/document/model" xmlns:mc="http://schemas.openxmlformats.org/markup-compatibility/2006" xmlns:r="http://schemas.openxmlformats.org/officeDocument/2006/relationships" w:conformance="transitional" mc:Ignorable="vyd">
   <w:background w:color="FFFFFF"/>
   <w:body vyd:_id="vyd:00000000000001">
     <w:p vyd:_id="vyd:0000000000024d">
@@ -3046,6 +3046,12 @@
                 <w:rFonts w:ascii="Times New Roman" w:hAnsi="Times New Roman" w:cs="Times New Roman"/>
               </w:rPr>
             </w:pPr>
+            <w:r>
+              <w:rPr>
+                <w:rFonts w:ascii="Times New Roman" w:hAnsi="Times New Roman" w:cs="Times New Roman"/>
+              </w:rPr>
+              <w:t vyd:_id="vyd:mowh5hra9ezah9">Макс</w:t>
+            </w:r>
           </w:p>
         </w:tc>
         <w:tc vyd:_id="vyd:000000000001vw">
@@ -3985,6 +3991,12 @@
                 <w:rFonts w:ascii="Times New Roman" w:hAnsi="Times New Roman" w:cs="Times New Roman"/>
               </w:rPr>
             </w:pPr>
+            <w:r>
+              <w:rPr>
+                <w:rFonts w:ascii="Times New Roman" w:hAnsi="Times New Roman" w:cs="Times New Roman"/>
+              </w:rPr>
+              <w:t vyd:_id="vyd:mowh5obcnpfjf4">макс</w:t>
+            </w:r>
           </w:p>
         </w:tc>
         <w:tc vyd:_id="vyd:000000000001tb">
@@ -20943,6 +20955,13 @@
                 <w:szCs w:val="20"/>
               </w:rPr>
             </w:pPr>
+            <w:r>
+              <w:rPr>
+                <w:rFonts w:ascii="Times New Roman" w:hAnsi="Times New Roman" w:cs="Times New Roman"/>
+                <w:sz w:val="20"/>
+              </w:rPr>
+              <w:t vyd:_id="vyd:mowcuo12v2tkl5">Система допусковв и посадок</w:t>
+            </w:r>
           </w:p>
         </w:tc>
       </w:tr>
@@ -21107,6 +21126,13 @@
                 <w:szCs w:val="20"/>
               </w:rPr>
             </w:pPr>
+            <w:r>
+              <w:rPr>
+                <w:rFonts w:ascii="Times New Roman" w:hAnsi="Times New Roman" w:cs="Times New Roman"/>
+                <w:sz w:val="20"/>
+              </w:rPr>
+              <w:t vyd:_id="vyd:mowcvbjtm31s6b">Макс</w:t>
+            </w:r>
           </w:p>
         </w:tc>
       </w:tr>
@@ -21257,6 +21283,13 @@
                 <w:szCs w:val="20"/>
               </w:rPr>
             </w:pPr>
+            <w:r>
+              <w:rPr>
+                <w:rFonts w:ascii="Times New Roman" w:hAnsi="Times New Roman" w:cs="Times New Roman"/>
+                <w:sz w:val="20"/>
+              </w:rPr>
+              <w:t vyd:_id="vyd:mowcvhj2sae26z">Выполнить конспект</w:t>
+            </w:r>
           </w:p>
         </w:tc>
       </w:tr>
@@ -21627,6 +21660,13 @@
                 <w:szCs w:val="20"/>
               </w:rPr>
             </w:pPr>
+            <w:r>
+              <w:rPr>
+                <w:rFonts w:ascii="Times New Roman" w:hAnsi="Times New Roman" w:cs="Times New Roman"/>
+                <w:sz w:val="20"/>
+              </w:rPr>
+              <w:t vyd:_id="vyd:mowcwhu2yxki27">Конструкционые материалы,марки.</w:t>
+            </w:r>
           </w:p>
         </w:tc>
       </w:tr>
@@ -21791,6 +21831,13 @@
                 <w:szCs w:val="20"/>
               </w:rPr>
             </w:pPr>
+            <w:r>
+              <w:rPr>
+                <w:rFonts w:ascii="Times New Roman" w:hAnsi="Times New Roman" w:cs="Times New Roman"/>
+                <w:sz w:val="20"/>
+              </w:rPr>
+              <w:t vyd:_id="vyd:mowcxhstgkpc4p">Макс</w:t>
+            </w:r>
           </w:p>
         </w:tc>
       </w:tr>
@@ -21943,6 +21990,13 @@
                 <w:szCs w:val="20"/>
               </w:rPr>
             </w:pPr>
+            <w:r>
+              <w:rPr>
+                <w:rFonts w:ascii="Times New Roman" w:hAnsi="Times New Roman" w:cs="Times New Roman"/>
+                <w:sz w:val="20"/>
+              </w:rPr>
+              <w:t vyd:_id="vyd:mowcxxst3s4dqq">Выполнить конспект с перечнем марок материалов.</w:t>
+            </w:r>
           </w:p>
         </w:tc>
       </w:tr>
@@ -24729,6 +24783,13 @@
                 <w:szCs w:val="18"/>
               </w:rPr>
             </w:pPr>
+            <w:r>
+              <w:rPr>
+                <w:rFonts w:ascii="Times New Roman" w:hAnsi="Times New Roman" w:cs="Times New Roman"/>
+                <w:sz w:val="18"/>
+              </w:rPr>
+              <w:t vyd:_id="vyd:mowczs0gwsbimu">Средства для  измерения линейных размеров</w:t>
+            </w:r>
           </w:p>
         </w:tc>
       </w:tr>
@@ -24837,6 +24898,13 @@
                 <w:szCs w:val="18"/>
               </w:rPr>
             </w:pPr>
+            <w:r>
+              <w:rPr>
+                <w:rFonts w:ascii="Times New Roman" w:hAnsi="Times New Roman" w:cs="Times New Roman"/>
+                <w:sz w:val="18"/>
+              </w:rPr>
+              <w:t vyd:_id="vyd:mowd0l98whn14m">макс</w:t>
+            </w:r>
           </w:p>
         </w:tc>
       </w:tr>
@@ -24945,6 +25013,13 @@
                 <w:szCs w:val="18"/>
               </w:rPr>
             </w:pPr>
+            <w:r>
+              <w:rPr>
+                <w:rFonts w:ascii="Times New Roman" w:hAnsi="Times New Roman" w:cs="Times New Roman"/>
+                <w:sz w:val="18"/>
+              </w:rPr>
+              <w:t vyd:_id="vyd:mowd0qeggke047" xml:space="preserve">Конспект </w:t>
+            </w:r>
           </w:p>
         </w:tc>
       </w:tr>
@@ -25171,6 +25246,13 @@
                 <w:szCs w:val="18"/>
               </w:rPr>
             </w:pPr>
+            <w:r>
+              <w:rPr>
+                <w:rFonts w:ascii="Times New Roman" w:hAnsi="Times New Roman" w:cs="Times New Roman"/>
+                <w:sz w:val="18"/>
+              </w:rPr>
+              <w:t vyd:_id="vyd:mowd18jm3bb3ft">Меры,назначение</w:t>
+            </w:r>
           </w:p>
         </w:tc>
       </w:tr>
@@ -25279,6 +25361,13 @@
                 <w:szCs w:val="18"/>
               </w:rPr>
             </w:pPr>
+            <w:r>
+              <w:rPr>
+                <w:rFonts w:ascii="Times New Roman" w:hAnsi="Times New Roman" w:cs="Times New Roman"/>
+                <w:sz w:val="18"/>
+              </w:rPr>
+              <w:t vyd:_id="vyd:mowd1zvztqhtxu">макс</w:t>
+            </w:r>
           </w:p>
         </w:tc>
       </w:tr>
@@ -25387,6 +25476,13 @@
                 <w:szCs w:val="18"/>
               </w:rPr>
             </w:pPr>
+            <w:r>
+              <w:rPr>
+                <w:rFonts w:ascii="Times New Roman" w:hAnsi="Times New Roman" w:cs="Times New Roman"/>
+                <w:sz w:val="18"/>
+              </w:rPr>
+              <w:t vyd:_id="vyd:mowd24xdunahos">Перечень мер</w:t>
+            </w:r>
           </w:p>
         </w:tc>
       </w:tr>
@@ -25598,6 +25694,13 @@
                 <w:szCs w:val="18"/>
               </w:rPr>
             </w:pPr>
+            <w:r>
+              <w:rPr>
+                <w:rFonts w:ascii="Times New Roman" w:hAnsi="Times New Roman" w:cs="Times New Roman"/>
+                <w:sz w:val="18"/>
+              </w:rPr>
+              <w:t vyd:_id="vyd:mowd343n70q73y">Штангенинструменты</w:t>
+            </w:r>
           </w:p>
         </w:tc>
       </w:tr>
@@ -25699,6 +25802,13 @@
                 <w:szCs w:val="18"/>
               </w:rPr>
             </w:pPr>
+            <w:r>
+              <w:rPr>
+                <w:rFonts w:ascii="Times New Roman" w:hAnsi="Times New Roman" w:cs="Times New Roman"/>
+                <w:sz w:val="18"/>
+              </w:rPr>
+              <w:t vyd:_id="vyd:mowd3nxbvip6gv">макс</w:t>
+            </w:r>
           </w:p>
         </w:tc>
       </w:tr>
@@ -25800,6 +25910,13 @@
                 <w:szCs w:val="18"/>
               </w:rPr>
             </w:pPr>
+            <w:r>
+              <w:rPr>
+                <w:rFonts w:ascii="Times New Roman" w:hAnsi="Times New Roman" w:cs="Times New Roman"/>
+                <w:sz w:val="18"/>
+              </w:rPr>
+              <w:t vyd:_id="vyd:mowd3wsfpobslw">Виды инструментов</w:t>
+            </w:r>
           </w:p>
         </w:tc>
       </w:tr>
@@ -26016,6 +26133,14 @@
                 <w:szCs w:val="18"/>
               </w:rPr>
             </w:pPr>
+            <w:r>
+              <w:rPr>
+                <w:rFonts w:ascii="Times New Roman" w:hAnsi="Times New Roman" w:cs="Times New Roman"/>
+                <w:sz w:val="18"/>
+                <w:color w:val="000000"/>
+              </w:rPr>
+              <w:t vyd:_id="vyd:mowd4p0ofqrmpl">Микрометрические инструменты</w:t>
+            </w:r>
           </w:p>
         </w:tc>
       </w:tr>
@@ -26120,6 +26245,14 @@
                 <w:szCs w:val="20"/>
               </w:rPr>
             </w:pPr>
+            <w:r>
+              <w:rPr>
+                <w:rFonts w:ascii="Times New Roman" w:hAnsi="Times New Roman" w:cs="Times New Roman"/>
+                <w:sz w:val="20"/>
+                <w:color w:val="000000"/>
+              </w:rPr>
+              <w:t vyd:_id="vyd:mowd55wwoxpmhk">макс</w:t>
+            </w:r>
           </w:p>
         </w:tc>
       </w:tr>
@@ -26224,6 +26357,14 @@
                 <w:szCs w:val="20"/>
               </w:rPr>
             </w:pPr>
+            <w:r>
+              <w:rPr>
+                <w:rFonts w:ascii="Times New Roman" w:hAnsi="Times New Roman" w:cs="Times New Roman"/>
+                <w:sz w:val="20"/>
+                <w:color w:val="000000"/>
+              </w:rPr>
+              <w:t vyd:_id="vyd:mowd5cr7w03dfg">конспект</w:t>
+            </w:r>
           </w:p>
         </w:tc>
       </w:tr>
@@ -29776,7 +29917,7 @@
 </file>
 
 <file path=word/footer1.xml><?xml version="1.0" encoding="utf-8"?>
-<w:ftr xmlns:w="http://schemas.openxmlformats.org/wordprocessingml/2006/main" xmlns:vyd="http://volga.yandex.com/schemas/document/model" vyd:_id="vyd:0000000000024e">
+<w:ftr xmlns:vyd="http://volga.yandex.com/schemas/document/model" xmlns:w="http://schemas.openxmlformats.org/wordprocessingml/2006/main" vyd:_id="vyd:0000000000024e">
   <w:p vyd:_id="vyd:0000000000024f">
     <w:pPr>
       <w:pStyle w:val="Footer"/>

</xml_diff>

<commit_message>
Sync schedule files 2026-05-08 07:41
</commit_message>
<xml_diff>
--- a/schedule/11.05.2026 ПОНЕДЕЛЬНИК.docx
+++ b/schedule/11.05.2026 ПОНЕДЕЛЬНИК.docx
@@ -2820,21 +2820,33 @@
         <w:tc vyd:_id="vyd:000000000001wi">
           <w:tcPr>
             <w:tcBorders>
-              <w:top w:val="single" w:color="000000" w:sz="4" w:space="0"/>
-              <w:start w:val="single" w:color="000000" w:sz="4" w:space="0"/>
-              <w:bottom w:val="single" w:color="000000" w:sz="4" w:space="0"/>
-              <w:end w:val="single" w:color="000000" w:sz="4" w:space="0"/>
-            </w:tcBorders>
+              <w:top w:val="single" w:sz="8"/>
+              <w:start w:val="single" w:sz="8"/>
+              <w:bottom w:val="single" w:sz="8"/>
+              <w:end w:val="single" w:sz="8"/>
+            </w:tcBorders>
+            <w:tcMar>
+              <w:top w:w="0" w:type="dxa"/>
+              <w:start w:w="108" w:type="dxa"/>
+              <w:bottom w:w="0" w:type="dxa"/>
+              <w:end w:w="108" w:type="dxa"/>
+            </w:tcMar>
           </w:tcPr>
           <w:p vyd:_id="vyd:000000000001wj">
             <w:pPr>
-              <w:pStyle w:val="Normal"/>
-              <w:snapToGrid w:val="0"/>
-              <w:spacing w:lineRule="auto" w:line="240" w:before="0" w:after="0"/>
-              <w:rPr>
-                <w:rFonts w:ascii="Times New Roman" w:hAnsi="Times New Roman" w:cs="Times New Roman"/>
-              </w:rPr>
-            </w:pPr>
+              <w:spacing w:after="0" w:before="0"/>
+              <w:ind w:start="0" w:end="0"/>
+              <w:rPr>
+                <w:rFonts w:ascii="Times New Roman" w:hAnsi="Times New Roman" w:cs="Times New Roman"/>
+              </w:rPr>
+            </w:pPr>
+            <w:r>
+              <w:rPr>
+                <w:rFonts w:ascii="Times New Roman" w:hAnsi="Times New Roman" w:eastAsia="Times New Roman" w:cs="Times New Roman"/>
+                <w:sz w:val="19"/>
+              </w:rPr>
+              <w:t vyd:_id="vyd:mowh6pk0ym0nr7">Социальные общности, группы, их типы.</w:t>
+            </w:r>
           </w:p>
         </w:tc>
         <w:tc vyd:_id="vyd:000000000001wg">
@@ -2895,6 +2907,13 @@
                 <w:rFonts w:ascii="Times New Roman" w:hAnsi="Times New Roman" w:cs="Times New Roman"/>
               </w:rPr>
             </w:pPr>
+            <w:r>
+              <w:rPr>
+                <w:rFonts w:ascii="Times New Roman" w:hAnsi="Times New Roman" w:eastAsia="Times New Roman" w:cs="Times New Roman"/>
+                <w:sz w:val="24"/>
+              </w:rPr>
+              <w:t vyd:_id="vyd:mownch5dzut5k8">Нахождение производной</w:t>
+            </w:r>
           </w:p>
         </w:tc>
         <w:tc vyd:_id="vyd:000000000001wa">
@@ -3112,6 +3131,12 @@
                 <w:rFonts w:ascii="Times New Roman" w:hAnsi="Times New Roman" w:cs="Times New Roman"/>
               </w:rPr>
             </w:pPr>
+            <w:r>
+              <w:rPr>
+                <w:rFonts w:ascii="Times New Roman" w:hAnsi="Times New Roman" w:cs="Times New Roman"/>
+              </w:rPr>
+              <w:t vyd:_id="vyd:mowncrze1yiujf">Макс</w:t>
+            </w:r>
           </w:p>
         </w:tc>
         <w:tc vyd:_id="vyd:000000000001vq">
@@ -3255,8 +3280,23 @@
               <w:spacing w:lineRule="auto" w:line="240" w:before="0" w:after="0"/>
               <w:rPr>
                 <w:rFonts w:ascii="Times New Roman" w:hAnsi="Times New Roman" w:cs="Times New Roman"/>
-              </w:rPr>
-            </w:pPr>
+                <w:sz w:val="16"/>
+              </w:rPr>
+            </w:pPr>
+            <w:r>
+              <w:rPr>
+                <w:rFonts w:ascii="Times New Roman" w:hAnsi="Times New Roman" w:cs="Times New Roman"/>
+                <w:sz w:val="16"/>
+              </w:rPr>
+              <w:t vyd:_id="vyd:mowh7ydlbzndxi" xml:space="preserve">Составить конспект темы по ссылке </w:t>
+            </w:r>
+            <w:r>
+              <w:rPr>
+                <w:rFonts w:ascii="Times New Roman" w:hAnsi="Times New Roman" w:cs="Times New Roman"/>
+                <w:sz w:val="16"/>
+              </w:rPr>
+              <w:t vyd:_id="vyd:mowh85l7yylldz">https://foxford.ru/wiki/obschestvoznanie/sotsialnaya-gruppa?utm_referrer=https%3A%2F%2Fyandex.ru%2F</w:t>
+            </w:r>
           </w:p>
         </w:tc>
         <w:tc vyd:_id="vyd:000000000001vc">
@@ -3317,6 +3357,12 @@
                 <w:rFonts w:ascii="Times New Roman" w:hAnsi="Times New Roman" w:cs="Times New Roman"/>
               </w:rPr>
             </w:pPr>
+            <w:r>
+              <w:rPr>
+                <w:rFonts w:ascii="Times New Roman" w:hAnsi="Times New Roman" w:cs="Times New Roman"/>
+              </w:rPr>
+              <w:t vyd:_id="vyd:mowneqmhxptuqi">Выполнить задание</w:t>
+            </w:r>
           </w:p>
         </w:tc>
         <w:tc vyd:_id="vyd:000000000001v6">
@@ -3754,21 +3800,33 @@
         <w:tc vyd:_id="vyd:000000000001tx">
           <w:tcPr>
             <w:tcBorders>
-              <w:top w:val="single" w:color="000000" w:sz="4" w:space="0"/>
-              <w:start w:val="single" w:color="000000" w:sz="4" w:space="0"/>
-              <w:bottom w:val="single" w:color="000000" w:sz="4" w:space="0"/>
-              <w:end w:val="single" w:color="000000" w:sz="4" w:space="0"/>
-            </w:tcBorders>
+              <w:top w:val="single" w:sz="8"/>
+              <w:start w:val="single" w:sz="8"/>
+              <w:bottom w:val="single" w:sz="8"/>
+              <w:end w:val="single" w:sz="8"/>
+            </w:tcBorders>
+            <w:tcMar>
+              <w:top w:w="0" w:type="dxa"/>
+              <w:start w:w="108" w:type="dxa"/>
+              <w:bottom w:w="0" w:type="dxa"/>
+              <w:end w:w="108" w:type="dxa"/>
+            </w:tcMar>
           </w:tcPr>
           <w:p vyd:_id="vyd:000000000001ty">
             <w:pPr>
-              <w:pStyle w:val="Normal"/>
-              <w:snapToGrid w:val="0"/>
-              <w:spacing w:lineRule="auto" w:line="240" w:before="0" w:after="0"/>
-              <w:rPr>
-                <w:rFonts w:ascii="Times New Roman" w:hAnsi="Times New Roman" w:cs="Times New Roman"/>
-              </w:rPr>
-            </w:pPr>
+              <w:spacing w:after="0" w:before="0"/>
+              <w:ind w:start="0" w:end="0"/>
+              <w:rPr>
+                <w:rFonts w:ascii="Times New Roman" w:hAnsi="Times New Roman" w:cs="Times New Roman"/>
+              </w:rPr>
+            </w:pPr>
+            <w:r>
+              <w:rPr>
+                <w:rFonts w:ascii="Times New Roman" w:hAnsi="Times New Roman" w:eastAsia="Times New Roman" w:cs="Times New Roman"/>
+                <w:sz w:val="19"/>
+              </w:rPr>
+              <w:t vyd:_id="vyd:mowh9wfhd44ct9">Социальная структура российского общества.</w:t>
+            </w:r>
           </w:p>
         </w:tc>
         <w:tc vyd:_id="vyd:000000000001tv">
@@ -3829,6 +3887,13 @@
                 <w:rFonts w:ascii="Times New Roman" w:hAnsi="Times New Roman" w:cs="Times New Roman"/>
               </w:rPr>
             </w:pPr>
+            <w:r>
+              <w:rPr>
+                <w:rFonts w:ascii="Times New Roman" w:hAnsi="Times New Roman" w:eastAsia="Times New Roman" w:cs="Times New Roman"/>
+                <w:sz w:val="24"/>
+              </w:rPr>
+              <w:t vyd:_id="vyd:mowncm2wv2av0c">Нахождение производной</w:t>
+            </w:r>
           </w:p>
         </w:tc>
         <w:tc vyd:_id="vyd:000000000001tp">
@@ -4057,6 +4122,12 @@
                 <w:rFonts w:ascii="Times New Roman" w:hAnsi="Times New Roman" w:cs="Times New Roman"/>
               </w:rPr>
             </w:pPr>
+            <w:r>
+              <w:rPr>
+                <w:rFonts w:ascii="Times New Roman" w:hAnsi="Times New Roman" w:cs="Times New Roman"/>
+              </w:rPr>
+              <w:t vyd:_id="vyd:mownd30i26oh45">Макс</w:t>
+            </w:r>
           </w:p>
         </w:tc>
         <w:tc vyd:_id="vyd:000000000001t5">
@@ -4217,8 +4288,23 @@
               <w:spacing w:lineRule="auto" w:line="240" w:before="0" w:after="0"/>
               <w:rPr>
                 <w:rFonts w:ascii="Times New Roman" w:hAnsi="Times New Roman" w:cs="Times New Roman"/>
-              </w:rPr>
-            </w:pPr>
+                <w:sz w:val="18"/>
+              </w:rPr>
+            </w:pPr>
+            <w:r>
+              <w:rPr>
+                <w:rFonts w:ascii="Times New Roman" w:hAnsi="Times New Roman" w:cs="Times New Roman"/>
+                <w:sz w:val="18"/>
+              </w:rPr>
+              <w:t vyd:_id="vyd:mowh98ceb361co" xml:space="preserve">Составить конспект темы по ссылке </w:t>
+            </w:r>
+            <w:r>
+              <w:rPr>
+                <w:rFonts w:ascii="Times New Roman" w:hAnsi="Times New Roman" w:cs="Times New Roman"/>
+                <w:sz w:val="18"/>
+              </w:rPr>
+              <w:t vyd:_id="vyd:mowh9gdvc3x8is">https://foxford.ru/wiki/obschestvoznanie/socialnaya-situation-v-sovremennoi-russia</w:t>
+            </w:r>
           </w:p>
         </w:tc>
         <w:tc vyd:_id="vyd:000000000001sr">
@@ -4279,6 +4365,12 @@
                 <w:rFonts w:ascii="Times New Roman" w:hAnsi="Times New Roman" w:cs="Times New Roman"/>
               </w:rPr>
             </w:pPr>
+            <w:r>
+              <w:rPr>
+                <w:rFonts w:ascii="Times New Roman" w:hAnsi="Times New Roman" w:cs="Times New Roman"/>
+              </w:rPr>
+              <w:t vyd:_id="vyd:mownf3lhjcif9n">Выполнить задание</w:t>
+            </w:r>
           </w:p>
         </w:tc>
         <w:tc vyd:_id="vyd:000000000001sl">

</xml_diff>

<commit_message>
Sync schedule files 2026-05-08 09:21
</commit_message>
<xml_diff>
--- a/schedule/11.05.2026 ПОНЕДЕЛЬНИК.docx
+++ b/schedule/11.05.2026 ПОНЕДЕЛЬНИК.docx
@@ -2777,6 +2777,13 @@
                 <w:szCs w:val="14"/>
               </w:rPr>
             </w:pPr>
+            <w:r>
+              <w:rPr>
+                <w:rFonts w:ascii="Times New Roman" w:hAnsi="Times New Roman" w:eastAsia="Times New Roman" w:cs="Times New Roman"/>
+                <w:sz w:val="19"/>
+              </w:rPr>
+              <w:t vyd:_id="vyd:mowmoldejpswmr">Этнос и этнические общности</w:t>
+            </w:r>
           </w:p>
         </w:tc>
         <w:tc vyd:_id="vyd:000000000001wk">
@@ -3019,6 +3026,9 @@
                 <w:szCs w:val="14"/>
               </w:rPr>
             </w:pPr>
+            <w:r>
+              <w:t vyd:_id="vyd:mowmox7bdv1ar8">MAX</w:t>
+            </w:r>
           </w:p>
         </w:tc>
         <w:tc vyd:_id="vyd:000000000001w0">
@@ -3242,6 +3252,9 @@
                 <w:szCs w:val="14"/>
               </w:rPr>
             </w:pPr>
+            <w:r>
+              <w:t vyd:_id="vyd:mowmpj0mupwpc0">Конспект</w:t>
+            </w:r>
           </w:p>
         </w:tc>
         <w:tc vyd:_id="vyd:000000000001vg">
@@ -3757,6 +3770,13 @@
                 <w:szCs w:val="14"/>
               </w:rPr>
             </w:pPr>
+            <w:r>
+              <w:rPr>
+                <w:rFonts w:ascii="Times New Roman" w:hAnsi="Times New Roman" w:eastAsia="Times New Roman" w:cs="Times New Roman"/>
+                <w:sz w:val="19"/>
+              </w:rPr>
+              <w:t vyd:_id="vyd:mowmp5wml3xq7k">Нации и межнациональные отношения</w:t>
+            </w:r>
           </w:p>
         </w:tc>
         <w:tc vyd:_id="vyd:000000000001tz">
@@ -3998,6 +4018,9 @@
                 <w:szCs w:val="14"/>
               </w:rPr>
             </w:pPr>
+            <w:r>
+              <w:t vyd:_id="vyd:mowmp03ll23rdx">MAX</w:t>
+            </w:r>
           </w:p>
         </w:tc>
         <w:tc vyd:_id="vyd:000000000001tf">
@@ -4232,6 +4255,9 @@
                 <w:szCs w:val="14"/>
               </w:rPr>
             </w:pPr>
+            <w:r>
+              <w:t vyd:_id="vyd:mowmpkpb6ohz40">Конспект</w:t>
+            </w:r>
           </w:p>
         </w:tc>
         <w:tc vyd:_id="vyd:000000000001sv">

</xml_diff>

<commit_message>
Sync schedule files 2026-05-08 19:17
</commit_message>
<xml_diff>
--- a/schedule/11.05.2026 ПОНЕДЕЛЬНИК.docx
+++ b/schedule/11.05.2026 ПОНЕДЕЛЬНИК.docx
@@ -1,6 +1,6 @@
 
 <file path=word/document.xml><?xml version="1.0" encoding="utf-8"?>
-<w:document xmlns:w="http://schemas.openxmlformats.org/wordprocessingml/2006/main" xmlns:vyd="http://volga.yandex.com/schemas/document/model" xmlns:mc="http://schemas.openxmlformats.org/markup-compatibility/2006" xmlns:r="http://schemas.openxmlformats.org/officeDocument/2006/relationships" w:conformance="transitional" mc:Ignorable="vyd">
+<w:document xmlns:mc="http://schemas.openxmlformats.org/markup-compatibility/2006" xmlns:r="http://schemas.openxmlformats.org/officeDocument/2006/relationships" xmlns:w="http://schemas.openxmlformats.org/wordprocessingml/2006/main" xmlns:vyd="http://volga.yandex.com/schemas/document/model" w:conformance="transitional" mc:Ignorable="vyd">
   <w:background w:color="FFFFFF"/>
   <w:body vyd:_id="vyd:00000000000001">
     <w:p vyd:_id="vyd:0000000000024d">
@@ -7435,6 +7435,13 @@
                 <w:szCs w:val="24"/>
               </w:rPr>
             </w:pPr>
+            <w:r>
+              <w:rPr>
+                <w:rFonts w:ascii="Times New Roman" w:hAnsi="Times New Roman" w:cs="Times New Roman"/>
+                <w:sz w:val="24"/>
+              </w:rPr>
+              <w:t vyd:_id="vyd:mox9t9jya7rlos" xml:space="preserve">Б.  Пастернак. </w:t>
+            </w:r>
           </w:p>
         </w:tc>
         <w:tc vyd:_id="vyd:000000000001k7">
@@ -7667,6 +7674,13 @@
                 <w:szCs w:val="24"/>
               </w:rPr>
             </w:pPr>
+            <w:r>
+              <w:rPr>
+                <w:rFonts w:ascii="Times New Roman" w:hAnsi="Times New Roman" w:cs="Times New Roman"/>
+                <w:sz w:val="24"/>
+              </w:rPr>
+              <w:t vyd:_id="vyd:mox9u348yc9bn1">Max</w:t>
+            </w:r>
           </w:p>
         </w:tc>
         <w:tc vyd:_id="vyd:000000000001jn">
@@ -7897,6 +7911,13 @@
                 <w:szCs w:val="24"/>
               </w:rPr>
             </w:pPr>
+            <w:r>
+              <w:rPr>
+                <w:rFonts w:ascii="Times New Roman" w:hAnsi="Times New Roman" w:cs="Times New Roman"/>
+                <w:sz w:val="24"/>
+              </w:rPr>
+              <w:t vyd:_id="vyd:mox9uarm3hjihn">Конспект</w:t>
+            </w:r>
           </w:p>
         </w:tc>
         <w:tc vyd:_id="vyd:000000000001j3">
@@ -8438,6 +8459,13 @@
                 <w:szCs w:val="24"/>
               </w:rPr>
             </w:pPr>
+            <w:r>
+              <w:rPr>
+                <w:rFonts w:ascii="Times New Roman" w:hAnsi="Times New Roman" w:cs="Times New Roman"/>
+                <w:sz w:val="24"/>
+              </w:rPr>
+              <w:t vyd:_id="vyd:mox9upz7l2lyaf">Б. Пастернак</w:t>
+            </w:r>
           </w:p>
         </w:tc>
         <w:tc vyd:_id="vyd:000000000001hn">
@@ -8669,6 +8697,13 @@
                 <w:szCs w:val="24"/>
               </w:rPr>
             </w:pPr>
+            <w:r>
+              <w:rPr>
+                <w:rFonts w:ascii="Times New Roman" w:hAnsi="Times New Roman" w:cs="Times New Roman"/>
+                <w:sz w:val="24"/>
+              </w:rPr>
+              <w:t vyd:_id="vyd:mox9v5193oqol8">Max</w:t>
+            </w:r>
           </w:p>
         </w:tc>
         <w:tc vyd:_id="vyd:000000000001h3">
@@ -8899,6 +8934,13 @@
                 <w:szCs w:val="24"/>
               </w:rPr>
             </w:pPr>
+            <w:r>
+              <w:rPr>
+                <w:rFonts w:ascii="Times New Roman" w:hAnsi="Times New Roman" w:cs="Times New Roman"/>
+                <w:sz w:val="24"/>
+              </w:rPr>
+              <w:t vyd:_id="vyd:mox9va58x2i2qg">Конспект</w:t>
+            </w:r>
           </w:p>
         </w:tc>
         <w:tc vyd:_id="vyd:000000000001gj">

</xml_diff>

<commit_message>
Sync schedule files 2026-05-09 11:54
</commit_message>
<xml_diff>
--- a/schedule/11.05.2026 ПОНЕДЕЛЬНИК.docx
+++ b/schedule/11.05.2026 ПОНЕДЕЛЬНИК.docx
@@ -1,6 +1,6 @@
 
 <file path=word/document.xml><?xml version="1.0" encoding="utf-8"?>
-<w:document xmlns:mc="http://schemas.openxmlformats.org/markup-compatibility/2006" xmlns:r="http://schemas.openxmlformats.org/officeDocument/2006/relationships" xmlns:w="http://schemas.openxmlformats.org/wordprocessingml/2006/main" xmlns:vyd="http://volga.yandex.com/schemas/document/model" w:conformance="transitional" mc:Ignorable="vyd">
+<w:document xmlns:r="http://schemas.openxmlformats.org/officeDocument/2006/relationships" xmlns:mc="http://schemas.openxmlformats.org/markup-compatibility/2006" xmlns:vyd="http://volga.yandex.com/schemas/document/model" xmlns:w="http://schemas.openxmlformats.org/wordprocessingml/2006/main" w:conformance="transitional" mc:Ignorable="vyd">
   <w:background w:color="FFFFFF"/>
   <w:body vyd:_id="vyd:00000000000001">
     <w:p vyd:_id="vyd:0000000000024d">
@@ -7409,10 +7409,17 @@
               <w:spacing w:lineRule="auto" w:line="240" w:before="0" w:after="0"/>
               <w:rPr>
                 <w:rFonts w:ascii="Times New Roman" w:hAnsi="Times New Roman" w:cs="Times New Roman"/>
-                <w:sz w:val="14"/>
+                <w:sz w:val="22"/>
                 <w:szCs w:val="14"/>
               </w:rPr>
             </w:pPr>
+            <w:r>
+              <w:rPr>
+                <w:rFonts w:ascii="Times New Roman" w:hAnsi="Times New Roman" w:cs="Times New Roman"/>
+                <w:sz w:val="22"/>
+              </w:rPr>
+              <w:t vyd:_id="vyd:moy9amgehyksne">Случайные эксперименты (опыты) и случайные события. Элементарные события (исходы)</w:t>
+            </w:r>
           </w:p>
         </w:tc>
         <w:tc vyd:_id="vyd:000000000001k9">
@@ -7648,10 +7655,17 @@
               <w:spacing w:lineRule="auto" w:line="240" w:before="0" w:after="0"/>
               <w:rPr>
                 <w:rFonts w:ascii="Times New Roman" w:hAnsi="Times New Roman" w:cs="Times New Roman"/>
-                <w:sz w:val="14"/>
+                <w:sz w:val="24"/>
                 <w:szCs w:val="14"/>
               </w:rPr>
             </w:pPr>
+            <w:r>
+              <w:rPr>
+                <w:rFonts w:ascii="Times New Roman" w:hAnsi="Times New Roman" w:cs="Times New Roman"/>
+                <w:sz w:val="24"/>
+              </w:rPr>
+              <w:t vyd:_id="vyd:moy9cvz8bsi047">Макс</w:t>
+            </w:r>
           </w:p>
         </w:tc>
         <w:tc vyd:_id="vyd:000000000001jp">
@@ -7885,10 +7899,17 @@
               <w:spacing w:lineRule="auto" w:line="240" w:before="0" w:after="0"/>
               <w:rPr>
                 <w:rFonts w:ascii="Times New Roman" w:hAnsi="Times New Roman" w:cs="Times New Roman"/>
-                <w:sz w:val="14"/>
+                <w:sz w:val="24"/>
                 <w:szCs w:val="14"/>
               </w:rPr>
             </w:pPr>
+            <w:r>
+              <w:rPr>
+                <w:rFonts w:ascii="Times New Roman" w:hAnsi="Times New Roman" w:cs="Times New Roman"/>
+                <w:sz w:val="24"/>
+              </w:rPr>
+              <w:t vyd:_id="vyd:moy9d1iu8qdau0">Конспект</w:t>
+            </w:r>
           </w:p>
         </w:tc>
         <w:tc vyd:_id="vyd:000000000001j5">
@@ -8433,10 +8454,17 @@
               <w:spacing w:lineRule="auto" w:line="240" w:before="0" w:after="0"/>
               <w:rPr>
                 <w:rFonts w:ascii="Times New Roman" w:hAnsi="Times New Roman" w:cs="Times New Roman"/>
-                <w:sz w:val="14"/>
+                <w:sz w:val="22"/>
                 <w:szCs w:val="14"/>
               </w:rPr>
             </w:pPr>
+            <w:r>
+              <w:rPr>
+                <w:rFonts w:ascii="Times New Roman" w:hAnsi="Times New Roman" w:cs="Times New Roman"/>
+                <w:sz w:val="22"/>
+              </w:rPr>
+              <w:t vyd:_id="vyd:moy9c1ff2q9328">Вероятность случайного события. Близость частоты и вероятности событий.</w:t>
+            </w:r>
           </w:p>
         </w:tc>
         <w:tc vyd:_id="vyd:000000000001hp">
@@ -8671,10 +8699,17 @@
               <w:spacing w:lineRule="auto" w:line="240" w:before="0" w:after="0"/>
               <w:rPr>
                 <w:rFonts w:ascii="Times New Roman" w:hAnsi="Times New Roman" w:cs="Times New Roman"/>
-                <w:sz w:val="14"/>
+                <w:sz w:val="24"/>
                 <w:szCs w:val="14"/>
               </w:rPr>
             </w:pPr>
+            <w:r>
+              <w:rPr>
+                <w:rFonts w:ascii="Times New Roman" w:hAnsi="Times New Roman" w:cs="Times New Roman"/>
+                <w:sz w:val="24"/>
+              </w:rPr>
+              <w:t vyd:_id="vyd:moy9dk86hc7te3">Макс</w:t>
+            </w:r>
           </w:p>
         </w:tc>
         <w:tc vyd:_id="vyd:000000000001h5">
@@ -8908,10 +8943,17 @@
               <w:spacing w:lineRule="auto" w:line="240" w:before="0" w:after="0"/>
               <w:rPr>
                 <w:rFonts w:ascii="Times New Roman" w:hAnsi="Times New Roman" w:cs="Times New Roman"/>
-                <w:sz w:val="14"/>
+                <w:sz w:val="24"/>
                 <w:szCs w:val="14"/>
               </w:rPr>
             </w:pPr>
+            <w:r>
+              <w:rPr>
+                <w:rFonts w:ascii="Times New Roman" w:hAnsi="Times New Roman" w:cs="Times New Roman"/>
+                <w:sz w:val="24"/>
+              </w:rPr>
+              <w:t vyd:_id="vyd:moy9dnkknrspql">Решение задач по теме</w:t>
+            </w:r>
           </w:p>
         </w:tc>
         <w:tc vyd:_id="vyd:000000000001gl">
@@ -9652,17 +9694,21 @@
         <w:tc vyd:_id="vyd:000000000001ev">
           <w:tcPr>
             <w:tcBorders>
-              <w:top w:val="single" w:color="000000" w:sz="4" w:space="0"/>
-              <w:start w:val="single" w:color="000000" w:sz="4" w:space="0"/>
-              <w:bottom w:val="single" w:color="000000" w:sz="4" w:space="0"/>
-              <w:end w:val="single" w:color="000000" w:sz="4" w:space="0"/>
-            </w:tcBorders>
+              <w:top w:val="single" w:color="000000" w:sz="4"/>
+              <w:start w:val="single" w:color="000000" w:sz="4"/>
+              <w:bottom w:val="single" w:color="000000" w:sz="4"/>
+              <w:end w:val="single" w:color="000000" w:sz="4"/>
+            </w:tcBorders>
+            <w:tcMar>
+              <w:top w:w="60" w:type="dxa"/>
+              <w:start w:w="60" w:type="dxa"/>
+              <w:bottom w:w="60" w:type="dxa"/>
+              <w:end w:w="60" w:type="dxa"/>
+            </w:tcMar>
           </w:tcPr>
           <w:p vyd:_id="vyd:000000000001ew">
             <w:pPr>
-              <w:pStyle w:val="Normal"/>
-              <w:snapToGrid w:val="0"/>
-              <w:spacing w:lineRule="auto" w:line="240" w:before="0" w:after="0"/>
+              <w:spacing w:after="0" w:lineRule="auto" w:line="240" w:before="0"/>
               <w:rPr>
                 <w:rFonts w:ascii="Times New Roman" w:hAnsi="Times New Roman" w:cs="Times New Roman"/>
                 <w:sz w:val="24"/>
@@ -9670,6 +9716,20 @@
                 <w:szCs w:val="24"/>
               </w:rPr>
             </w:pPr>
+            <w:r>
+              <w:rPr>
+                <w:rFonts w:ascii="Calibri" w:hAnsi="Calibri" w:eastAsia="Calibri" w:cs="Calibri"/>
+                <w:sz w:val="22"/>
+              </w:rPr>
+              <w:t vyd:_id="vyd:moy94y489nl5i6" xml:space="preserve"> </w:t>
+            </w:r>
+            <w:r>
+              <w:rPr>
+                <w:rFonts w:ascii="Times New Roman" w:hAnsi="Times New Roman" w:eastAsia="Times New Roman" w:cs="Times New Roman"/>
+                <w:sz w:val="24"/>
+              </w:rPr>
+              <w:t vyd:_id="vyd:moy94y42jk56r4">Геометрическая оптика. Прямолинейное распространение света в однородной среде.</w:t>
+            </w:r>
           </w:p>
         </w:tc>
         <w:tc vyd:_id="vyd:000000000001et">
@@ -9897,6 +9957,14 @@
                 <w:szCs w:val="24"/>
               </w:rPr>
             </w:pPr>
+            <w:r>
+              <w:rPr>
+                <w:rFonts w:ascii="Times New Roman" w:hAnsi="Times New Roman" w:cs="Times New Roman"/>
+                <w:sz w:val="24"/>
+                <w:color w:val="000000"/>
+              </w:rPr>
+              <w:t vyd:_id="vyd:moy96b7gislmcg">Макс</w:t>
+            </w:r>
           </w:p>
         </w:tc>
         <w:tc vyd:_id="vyd:000000000001e9">
@@ -10117,6 +10185,14 @@
                 <w:szCs w:val="24"/>
               </w:rPr>
             </w:pPr>
+            <w:r>
+              <w:rPr>
+                <w:rFonts w:ascii="Times New Roman" w:hAnsi="Times New Roman" w:cs="Times New Roman"/>
+                <w:sz w:val="24"/>
+                <w:color w:val="000000"/>
+              </w:rPr>
+              <w:t vyd:_id="vyd:moy96hb0q76m9y">Решение задач по теме</w:t>
+            </w:r>
           </w:p>
         </w:tc>
         <w:tc vyd:_id="vyd:000000000001dp">
@@ -10683,17 +10759,21 @@
         <w:tc vyd:_id="vyd:000000000001c9">
           <w:tcPr>
             <w:tcBorders>
-              <w:top w:val="single" w:color="000000" w:sz="4" w:space="0"/>
-              <w:start w:val="single" w:color="000000" w:sz="4" w:space="0"/>
-              <w:bottom w:val="single" w:color="000000" w:sz="4" w:space="0"/>
-              <w:end w:val="single" w:color="000000" w:sz="4" w:space="0"/>
-            </w:tcBorders>
+              <w:top w:val="single" w:color="000000" w:sz="4"/>
+              <w:start w:val="single" w:color="000000" w:sz="4"/>
+              <w:bottom w:val="single" w:color="000000" w:sz="4"/>
+              <w:end w:val="single" w:color="000000" w:sz="4"/>
+            </w:tcBorders>
+            <w:tcMar>
+              <w:top w:w="60" w:type="dxa"/>
+              <w:start w:w="60" w:type="dxa"/>
+              <w:bottom w:w="60" w:type="dxa"/>
+              <w:end w:w="60" w:type="dxa"/>
+            </w:tcMar>
           </w:tcPr>
           <w:p vyd:_id="vyd:000000000001ca">
             <w:pPr>
-              <w:pStyle w:val="Normal"/>
-              <w:snapToGrid w:val="0"/>
-              <w:spacing w:lineRule="auto" w:line="240" w:before="0" w:after="0"/>
+              <w:spacing w:after="0" w:lineRule="auto" w:line="240" w:before="0"/>
               <w:rPr>
                 <w:rFonts w:ascii="Times New Roman" w:hAnsi="Times New Roman" w:cs="Times New Roman"/>
                 <w:sz w:val="24"/>
@@ -10701,6 +10781,13 @@
                 <w:szCs w:val="24"/>
               </w:rPr>
             </w:pPr>
+            <w:r>
+              <w:rPr>
+                <w:rFonts w:ascii="Times New Roman" w:hAnsi="Times New Roman" w:eastAsia="Times New Roman" w:cs="Times New Roman"/>
+                <w:sz w:val="24"/>
+              </w:rPr>
+              <w:t vyd:_id="vyd:moy95ygufpb12s">Дисперсия света. Сложный состав белого света.</w:t>
+            </w:r>
           </w:p>
         </w:tc>
         <w:tc vyd:_id="vyd:000000000001c7">
@@ -10931,6 +11018,14 @@
                 <w:szCs w:val="24"/>
               </w:rPr>
             </w:pPr>
+            <w:r>
+              <w:rPr>
+                <w:rFonts w:ascii="Times New Roman" w:hAnsi="Times New Roman" w:cs="Times New Roman"/>
+                <w:sz w:val="24"/>
+                <w:color w:val="000000"/>
+              </w:rPr>
+              <w:t vyd:_id="vyd:moy96ryunny368">Макс</w:t>
+            </w:r>
           </w:p>
         </w:tc>
         <w:tc vyd:_id="vyd:000000000001bn">
@@ -11164,6 +11259,14 @@
                 <w:szCs w:val="24"/>
               </w:rPr>
             </w:pPr>
+            <w:r>
+              <w:rPr>
+                <w:rFonts w:ascii="Times New Roman" w:hAnsi="Times New Roman" w:cs="Times New Roman"/>
+                <w:sz w:val="24"/>
+                <w:color w:val="000000"/>
+              </w:rPr>
+              <w:t vyd:_id="vyd:moy96xqsppuvl5">Решение задач по теме</w:t>
+            </w:r>
           </w:p>
         </w:tc>
         <w:tc vyd:_id="vyd:000000000001b3">
@@ -30077,7 +30180,7 @@
 </file>
 
 <file path=word/footer1.xml><?xml version="1.0" encoding="utf-8"?>
-<w:ftr xmlns:vyd="http://volga.yandex.com/schemas/document/model" xmlns:w="http://schemas.openxmlformats.org/wordprocessingml/2006/main" vyd:_id="vyd:0000000000024e">
+<w:ftr xmlns:w="http://schemas.openxmlformats.org/wordprocessingml/2006/main" xmlns:vyd="http://volga.yandex.com/schemas/document/model" vyd:_id="vyd:0000000000024e">
   <w:p vyd:_id="vyd:0000000000024f">
     <w:pPr>
       <w:pStyle w:val="Footer"/>

</xml_diff>

<commit_message>
Sync schedule files 2026-05-10 19:03
</commit_message>
<xml_diff>
--- a/schedule/11.05.2026 ПОНЕДЕЛЬНИК.docx
+++ b/schedule/11.05.2026 ПОНЕДЕЛЬНИК.docx
@@ -1,6 +1,6 @@
 
 <file path=word/document.xml><?xml version="1.0" encoding="utf-8"?>
-<w:document xmlns:r="http://schemas.openxmlformats.org/officeDocument/2006/relationships" xmlns:mc="http://schemas.openxmlformats.org/markup-compatibility/2006" xmlns:vyd="http://volga.yandex.com/schemas/document/model" xmlns:w="http://schemas.openxmlformats.org/wordprocessingml/2006/main" w:conformance="transitional" mc:Ignorable="vyd">
+<w:document xmlns:w="http://schemas.openxmlformats.org/wordprocessingml/2006/main" xmlns:r="http://schemas.openxmlformats.org/officeDocument/2006/relationships" xmlns:mc="http://schemas.openxmlformats.org/markup-compatibility/2006" xmlns:vyd="http://volga.yandex.com/schemas/document/model" w:conformance="transitional" mc:Ignorable="vyd">
   <w:background w:color="FFFFFF"/>
   <w:body vyd:_id="vyd:00000000000001">
     <w:p vyd:_id="vyd:0000000000024d">
@@ -1067,6 +1067,12 @@
                 <w:rFonts w:ascii="Times New Roman" w:hAnsi="Times New Roman" w:cs="Times New Roman"/>
               </w:rPr>
             </w:pPr>
+            <w:r>
+              <w:rPr>
+                <w:rFonts w:ascii="Times New Roman" w:hAnsi="Times New Roman" w:cs="Times New Roman"/>
+              </w:rPr>
+              <w:t vyd:_id="vyd:mp04bgste65b2y">Системы автоматизированного проектирования: история, назначение, примеры. КОМПАС – КОМПлекс Автоматизированных Систем</w:t>
+            </w:r>
           </w:p>
         </w:tc>
         <w:tc vyd:_id="vyd:0000000000021g">
@@ -1272,6 +1278,12 @@
                 <w:rFonts w:ascii="Times New Roman" w:hAnsi="Times New Roman" w:cs="Times New Roman"/>
               </w:rPr>
             </w:pPr>
+            <w:r>
+              <w:rPr>
+                <w:rFonts w:ascii="Times New Roman" w:hAnsi="Times New Roman" w:cs="Times New Roman"/>
+              </w:rPr>
+              <w:t vyd:_id="vyd:mp04blznfi6jud">Макс</w:t>
+            </w:r>
           </w:p>
         </w:tc>
         <w:tc vyd:_id="vyd:0000000000020w">
@@ -1477,6 +1489,12 @@
                 <w:rFonts w:ascii="Times New Roman" w:hAnsi="Times New Roman" w:cs="Times New Roman"/>
               </w:rPr>
             </w:pPr>
+            <w:r>
+              <w:rPr>
+                <w:rFonts w:ascii="Times New Roman" w:hAnsi="Times New Roman" w:cs="Times New Roman"/>
+              </w:rPr>
+              <w:t vyd:_id="vyd:mp04bx5qcfz1e8">Записи в тетради</w:t>
+            </w:r>
           </w:p>
         </w:tc>
         <w:tc vyd:_id="vyd:0000000000020c">
@@ -1936,6 +1954,14 @@
                 <w:rFonts w:ascii="Times New Roman" w:hAnsi="Times New Roman" w:cs="Times New Roman"/>
               </w:rPr>
             </w:pPr>
+            <w:r>
+              <w:rPr>
+                <w:rFonts w:ascii="Times New Roman" w:hAnsi="Times New Roman" w:eastAsia="Times New Roman" w:cs="Times New Roman"/>
+                <w:sz w:val="24"/>
+                <w:i w:val="1"/>
+              </w:rPr>
+              <w:t vyd:_id="vyd:mp04ciyaodrtvb">Запуск системы КОМПАС-3D. Интерфейс системы</w:t>
+            </w:r>
           </w:p>
         </w:tc>
         <w:tc vyd:_id="vyd:000000000001yz">
@@ -2141,6 +2167,12 @@
                 <w:rFonts w:ascii="Times New Roman" w:hAnsi="Times New Roman" w:cs="Times New Roman"/>
               </w:rPr>
             </w:pPr>
+            <w:r>
+              <w:rPr>
+                <w:rFonts w:ascii="Times New Roman" w:hAnsi="Times New Roman" w:cs="Times New Roman"/>
+              </w:rPr>
+              <w:t vyd:_id="vyd:mp04cljuup9cbb">Макс</w:t>
+            </w:r>
           </w:p>
         </w:tc>
         <w:tc vyd:_id="vyd:000000000001yf">
@@ -2346,6 +2378,12 @@
                 <w:rFonts w:ascii="Times New Roman" w:hAnsi="Times New Roman" w:cs="Times New Roman"/>
               </w:rPr>
             </w:pPr>
+            <w:r>
+              <w:rPr>
+                <w:rFonts w:ascii="Times New Roman" w:hAnsi="Times New Roman" w:cs="Times New Roman"/>
+              </w:rPr>
+              <w:t vyd:_id="vyd:mp04cqndf1slu1">Записи в тетради</w:t>
+            </w:r>
           </w:p>
         </w:tc>
         <w:tc vyd:_id="vyd:000000000001xv">
@@ -16657,6 +16695,14 @@
                 <w:szCs w:val="24"/>
               </w:rPr>
             </w:pPr>
+            <w:r>
+              <w:rPr>
+                <w:rFonts w:ascii="Times New Roman" w:hAnsi="Times New Roman" w:eastAsia="Times New Roman" w:cs="Times New Roman"/>
+                <w:sz w:val="24"/>
+                <w:i w:val="1"/>
+              </w:rPr>
+              <w:t vyd:_id="vyd:mp04e1znysmv6n">Создание 3d моделей по плоскому чертежу посредством операции «вращения».</w:t>
+            </w:r>
           </w:p>
         </w:tc>
         <w:tc vyd:_id="vyd:000000000000y0">
@@ -16915,6 +16961,13 @@
                 <w:szCs w:val="24"/>
               </w:rPr>
             </w:pPr>
+            <w:r>
+              <w:rPr>
+                <w:rFonts w:ascii="Times New Roman" w:hAnsi="Times New Roman" w:cs="Times New Roman"/>
+                <w:sz w:val="24"/>
+              </w:rPr>
+              <w:t vyd:_id="vyd:mp04e4zb3fgdst">Макс</w:t>
+            </w:r>
           </w:p>
         </w:tc>
         <w:tc vyd:_id="vyd:000000000000xg">
@@ -17164,6 +17217,13 @@
                 <w:szCs w:val="24"/>
               </w:rPr>
             </w:pPr>
+            <w:r>
+              <w:rPr>
+                <w:rFonts w:ascii="Times New Roman" w:hAnsi="Times New Roman" w:cs="Times New Roman"/>
+                <w:sz w:val="24"/>
+              </w:rPr>
+              <w:t vyd:_id="vyd:mp04ea7j9x7fo1">Практическая работа</w:t>
+            </w:r>
           </w:p>
         </w:tc>
         <w:tc vyd:_id="vyd:000000000000ww">
@@ -17566,7 +17626,7 @@
       </w:tr>
       <w:tr vyd:_id="vyd:000000000000vc">
         <w:trPr>
-          <w:trHeight w:val="23" w:hRule="atLeast"/>
+          <w:trHeight w:val="603.999" w:hRule="atLeast"/>
         </w:trPr>
         <w:tc vyd:_id="vyd:000000000000vu">
           <w:tcPr>
@@ -17736,6 +17796,14 @@
                 <w:szCs w:val="24"/>
               </w:rPr>
             </w:pPr>
+            <w:r>
+              <w:rPr>
+                <w:rFonts w:ascii="Times New Roman" w:hAnsi="Times New Roman" w:eastAsia="Times New Roman" w:cs="Times New Roman"/>
+                <w:sz w:val="24"/>
+                <w:i w:val="1"/>
+              </w:rPr>
+              <w:t vyd:_id="vyd:mp04elpcsnnrz5">Создание 3d моделей по плоскому чертежу посредством операции «вращения».</w:t>
+            </w:r>
           </w:p>
         </w:tc>
         <w:tc vyd:_id="vyd:000000000000vh">
@@ -17994,6 +18062,13 @@
                 <w:szCs w:val="24"/>
               </w:rPr>
             </w:pPr>
+            <w:r>
+              <w:rPr>
+                <w:rFonts w:ascii="Times New Roman" w:hAnsi="Times New Roman" w:cs="Times New Roman"/>
+                <w:sz w:val="24"/>
+              </w:rPr>
+              <w:t vyd:_id="vyd:mp04eqycpcd6if">Макс</w:t>
+            </w:r>
           </w:p>
         </w:tc>
         <w:tc vyd:_id="vyd:000000000000ux">
@@ -18243,6 +18318,13 @@
                 <w:szCs w:val="24"/>
               </w:rPr>
             </w:pPr>
+            <w:r>
+              <w:rPr>
+                <w:rFonts w:ascii="Times New Roman" w:hAnsi="Times New Roman" w:cs="Times New Roman"/>
+                <w:sz w:val="24"/>
+              </w:rPr>
+              <w:t vyd:_id="vyd:mp04ew6lllc6kj">Практическая работа</w:t>
+            </w:r>
           </w:p>
         </w:tc>
         <w:tc vyd:_id="vyd:000000000000ud">

</xml_diff>

<commit_message>
Sync schedule files 2026-05-12 06:36
</commit_message>
<xml_diff>
--- a/schedule/11.05.2026 ПОНЕДЕЛЬНИК.docx
+++ b/schedule/11.05.2026 ПОНЕДЕЛЬНИК.docx
@@ -1,6 +1,6 @@
 
 <file path=word/document.xml><?xml version="1.0" encoding="utf-8"?>
-<w:document xmlns:w="http://schemas.openxmlformats.org/wordprocessingml/2006/main" xmlns:r="http://schemas.openxmlformats.org/officeDocument/2006/relationships" xmlns:mc="http://schemas.openxmlformats.org/markup-compatibility/2006" xmlns:vyd="http://volga.yandex.com/schemas/document/model" w:conformance="transitional" mc:Ignorable="vyd">
+<w:document xmlns:mc="http://schemas.openxmlformats.org/markup-compatibility/2006" xmlns:vyd="http://volga.yandex.com/schemas/document/model" xmlns:w="http://schemas.openxmlformats.org/wordprocessingml/2006/main" xmlns:r="http://schemas.openxmlformats.org/officeDocument/2006/relationships" w:conformance="transitional" mc:Ignorable="vyd">
   <w:background w:color="FFFFFF"/>
   <w:body vyd:_id="vyd:00000000000001">
     <w:p vyd:_id="vyd:0000000000024d">
@@ -1007,6 +1007,13 @@
                 <w:szCs w:val="14"/>
               </w:rPr>
             </w:pPr>
+            <w:r>
+              <w:rPr>
+                <w:rFonts w:ascii="Times New Roman" w:hAnsi="Times New Roman" w:cs="Times New Roman"/>
+                <w:sz w:val="14"/>
+              </w:rPr>
+              <w:t vyd:_id="vyd:mp251363v6j364">Эстафетный бег</w:t>
+            </w:r>
           </w:p>
         </w:tc>
         <w:tc vyd:_id="vyd:0000000000021m">
@@ -1144,7 +1151,7 @@
       </w:tr>
       <w:tr vyd:_id="vyd:0000000000020r">
         <w:trPr>
-          <w:trHeight w:val="280" w:hRule="atLeast"/>
+          <w:trHeight w:val="356.456" w:hRule="atLeast"/>
         </w:trPr>
         <w:tc vyd:_id="vyd:00000000000219">
           <w:tcPr>
@@ -1218,6 +1225,13 @@
                 <w:szCs w:val="14"/>
               </w:rPr>
             </w:pPr>
+            <w:r>
+              <w:rPr>
+                <w:rFonts w:ascii="Times New Roman" w:hAnsi="Times New Roman" w:cs="Times New Roman"/>
+                <w:sz w:val="14"/>
+              </w:rPr>
+              <w:t vyd:_id="vyd:mp251i1sdl166m">Макс</w:t>
+            </w:r>
           </w:p>
         </w:tc>
         <w:tc vyd:_id="vyd:00000000000212">
@@ -1429,6 +1443,13 @@
                 <w:szCs w:val="14"/>
               </w:rPr>
             </w:pPr>
+            <w:r>
+              <w:rPr>
+                <w:rFonts w:ascii="Times New Roman" w:hAnsi="Times New Roman" w:cs="Times New Roman"/>
+                <w:sz w:val="14"/>
+              </w:rPr>
+              <w:t vyd:_id="vyd:mp2524m2pgcc33">Написать конспект</w:t>
+            </w:r>
           </w:p>
         </w:tc>
         <w:tc vyd:_id="vyd:0000000000020i">
@@ -1894,6 +1915,13 @@
                 <w:szCs w:val="14"/>
               </w:rPr>
             </w:pPr>
+            <w:r>
+              <w:rPr>
+                <w:rFonts w:ascii="Times New Roman" w:hAnsi="Times New Roman" w:cs="Times New Roman"/>
+                <w:sz w:val="14"/>
+              </w:rPr>
+              <w:t vyd:_id="vyd:mp252pcekh4ues">Бег на средние дистанции</w:t>
+            </w:r>
           </w:p>
         </w:tc>
         <w:tc vyd:_id="vyd:000000000001z5">
@@ -2107,6 +2135,13 @@
                 <w:szCs w:val="14"/>
               </w:rPr>
             </w:pPr>
+            <w:r>
+              <w:rPr>
+                <w:rFonts w:ascii="Times New Roman" w:hAnsi="Times New Roman" w:cs="Times New Roman"/>
+                <w:sz w:val="14"/>
+              </w:rPr>
+              <w:t vyd:_id="vyd:mp253mkrfdodqw">макс</w:t>
+            </w:r>
           </w:p>
         </w:tc>
         <w:tc vyd:_id="vyd:000000000001yl">
@@ -2318,6 +2353,13 @@
                 <w:szCs w:val="14"/>
               </w:rPr>
             </w:pPr>
+            <w:r>
+              <w:rPr>
+                <w:rFonts w:ascii="Times New Roman" w:hAnsi="Times New Roman" w:cs="Times New Roman"/>
+                <w:sz w:val="14"/>
+              </w:rPr>
+              <w:t vyd:_id="vyd:mp253wle1j6nwj">Написать конспект</w:t>
+            </w:r>
           </w:p>
         </w:tc>
         <w:tc vyd:_id="vyd:000000000001y1">
@@ -9791,6 +9833,14 @@
                 <w:szCs w:val="24"/>
               </w:rPr>
             </w:pPr>
+            <w:r>
+              <w:rPr>
+                <w:rFonts w:ascii="Times New Roman" w:hAnsi="Times New Roman" w:cs="Times New Roman"/>
+                <w:sz w:val="24"/>
+                <w:color w:val="000000"/>
+              </w:rPr>
+              <w:t vyd:_id="vyd:mp255mc6v36txg">Эстафетный бег</w:t>
+            </w:r>
           </w:p>
         </w:tc>
         <w:tc vyd:_id="vyd:000000000001er">
@@ -10026,6 +10076,14 @@
                 <w:szCs w:val="24"/>
               </w:rPr>
             </w:pPr>
+            <w:r>
+              <w:rPr>
+                <w:rFonts w:ascii="Times New Roman" w:hAnsi="Times New Roman" w:cs="Times New Roman"/>
+                <w:sz w:val="24"/>
+                <w:color w:val="000000"/>
+              </w:rPr>
+              <w:t vyd:_id="vyd:mowid98bwiach8">Макс</w:t>
+            </w:r>
           </w:p>
         </w:tc>
         <w:tc vyd:_id="vyd:000000000001e7">
@@ -10254,6 +10312,14 @@
                 <w:szCs w:val="24"/>
               </w:rPr>
             </w:pPr>
+            <w:r>
+              <w:rPr>
+                <w:rFonts w:ascii="Times New Roman" w:hAnsi="Times New Roman" w:cs="Times New Roman"/>
+                <w:sz w:val="24"/>
+                <w:color w:val="000000"/>
+              </w:rPr>
+              <w:t vyd:_id="vyd:mowidbm5zmox0t">Написать конспект</w:t>
+            </w:r>
           </w:p>
         </w:tc>
         <w:tc vyd:_id="vyd:000000000001dn">
@@ -10849,6 +10915,14 @@
                 <w:szCs w:val="24"/>
               </w:rPr>
             </w:pPr>
+            <w:r>
+              <w:rPr>
+                <w:rFonts w:ascii="Times New Roman" w:hAnsi="Times New Roman" w:cs="Times New Roman"/>
+                <w:sz w:val="24"/>
+                <w:color w:val="000000"/>
+              </w:rPr>
+              <w:t vyd:_id="vyd:mowidk5j3qx1su">Бег на средние дистанции</w:t>
+            </w:r>
           </w:p>
         </w:tc>
         <w:tc vyd:_id="vyd:000000000001c5">
@@ -10876,7 +10950,7 @@
       </w:tr>
       <w:tr vyd:_id="vyd:000000000001bk">
         <w:trPr>
-          <w:trHeight w:val="256.59" w:hRule="atLeast"/>
+          <w:trHeight w:val="227.064" w:hRule="atLeast"/>
         </w:trPr>
         <w:tc vyd:_id="vyd:000000000001c2">
           <w:tcPr>
@@ -11087,6 +11161,14 @@
                 <w:szCs w:val="24"/>
               </w:rPr>
             </w:pPr>
+            <w:r>
+              <w:rPr>
+                <w:rFonts w:ascii="Times New Roman" w:hAnsi="Times New Roman" w:cs="Times New Roman"/>
+                <w:sz w:val="24"/>
+                <w:color w:val="000000"/>
+              </w:rPr>
+              <w:t vyd:_id="vyd:mowidzw4ff5har">Макс</w:t>
+            </w:r>
           </w:p>
         </w:tc>
         <w:tc vyd:_id="vyd:000000000001bl">
@@ -11328,6 +11410,14 @@
                 <w:szCs w:val="24"/>
               </w:rPr>
             </w:pPr>
+            <w:r>
+              <w:rPr>
+                <w:rFonts w:ascii="Times New Roman" w:hAnsi="Times New Roman" w:cs="Times New Roman"/>
+                <w:sz w:val="24"/>
+                <w:color w:val="000000"/>
+              </w:rPr>
+              <w:t vyd:_id="vyd:mowie313wcqer6">Написать конспект</w:t>
+            </w:r>
           </w:p>
         </w:tc>
         <w:tc vyd:_id="vyd:000000000001b1">

</xml_diff>